<commit_message>
Second draft - 1859 words
</commit_message>
<xml_diff>
--- a/ASSESSMENT/Report/COM618_AE1_Report.docx
+++ b/ASSESSMENT/Report/COM618_AE1_Report.docx
@@ -77,61 +77,7 @@
         <w:rPr>
           <w:lang w:val="en-GB"/>
         </w:rPr>
-        <w:t xml:space="preserve">Hospital readmission within 30 days of discharge is </w:t>
-      </w:r>
-      <w:r>
-        <w:rPr>
-          <w:lang w:val="en-GB"/>
-        </w:rPr>
-        <w:t xml:space="preserve">a </w:t>
-      </w:r>
-      <w:r>
-        <w:rPr>
-          <w:lang w:val="en-GB"/>
-        </w:rPr>
-        <w:t>costly outcome</w:t>
-      </w:r>
-      <w:r>
-        <w:rPr>
-          <w:lang w:val="en-GB"/>
-        </w:rPr>
-        <w:t>s</w:t>
-      </w:r>
-      <w:r>
-        <w:rPr>
-          <w:lang w:val="en-GB"/>
-        </w:rPr>
-        <w:t xml:space="preserve"> in modern healthcare. The Hospital Readmissions Reduction Programme (HRRP) penalises US hospitals for excess 30-day readmissions[1]. </w:t>
-      </w:r>
-      <w:r>
-        <w:rPr>
-          <w:lang w:val="en-GB"/>
-        </w:rPr>
-        <w:t>Readmission</w:t>
-      </w:r>
-      <w:r>
-        <w:rPr>
-          <w:lang w:val="en-GB"/>
-        </w:rPr>
-        <w:t xml:space="preserve"> risk is high for diabetic patients, as diabetes interacts with </w:t>
-      </w:r>
-      <w:r>
-        <w:rPr>
-          <w:lang w:val="en-GB"/>
-        </w:rPr>
-        <w:t>many</w:t>
-      </w:r>
-      <w:r>
-        <w:rPr>
-          <w:lang w:val="en-GB"/>
-        </w:rPr>
-        <w:t xml:space="preserve"> other conditions and medications. Identifying patients at risk of early readmission before discharge is therefore </w:t>
-      </w:r>
-      <w:r>
-        <w:rPr>
-          <w:lang w:val="en-GB"/>
-        </w:rPr>
-        <w:t>benefitial.</w:t>
+        <w:t>Hospital readmission within 30 days of discharge is a costly outcomes in modern healthcare. The Hospital Readmissions Reduction Programme (HRRP) penalises US hospitals for excess 30-day readmissions[1]. Readmission risk is high for diabetic patients, as diabetes interacts with many other conditions and medications. Identifying patients at risk of early readmission before discharge is therefore benefitial.</w:t>
       </w:r>
     </w:p>
     <w:p>
@@ -202,7 +148,31 @@
         <w:rPr>
           <w:lang w:val="en-GB"/>
         </w:rPr>
-        <w:t>The dataset exhibits the three common quality problems in health informatics datasets: missing values, duplicate records, and inconsistent encoding.</w:t>
+        <w:t xml:space="preserve">The dataset </w:t>
+      </w:r>
+      <w:r>
+        <w:rPr>
+          <w:lang w:val="en-GB"/>
+        </w:rPr>
+        <w:t xml:space="preserve">has </w:t>
+      </w:r>
+      <w:r>
+        <w:rPr>
+          <w:lang w:val="en-GB"/>
+        </w:rPr>
+        <w:t xml:space="preserve">three </w:t>
+      </w:r>
+      <w:r>
+        <w:rPr>
+          <w:lang w:val="en-GB"/>
+        </w:rPr>
+        <w:t>major</w:t>
+      </w:r>
+      <w:r>
+        <w:rPr>
+          <w:lang w:val="en-GB"/>
+        </w:rPr>
+        <w:t xml:space="preserve"> quality problems: missing values, duplicate records, and inconsistent encoding.</w:t>
       </w:r>
     </w:p>
     <w:p>
@@ -230,7 +200,7 @@
         <w:rPr>
           <w:lang w:val="en-GB"/>
         </w:rPr>
-        <w:t>The dataset encodes missing data as '?' rather than a standard null value. Loading with na_values=['?'] converts all ‘?’ placeholders to NaN at import:</w:t>
+        <w:t>The dataset encodes missing data as '?' rather than a null value. Loading with na_values=['?'] converts ‘?’ to NaN at import:</w:t>
       </w:r>
     </w:p>
     <w:p>
@@ -244,7 +214,7 @@
         <mc:AlternateContent>
           <mc:Choice Requires="wps">
             <w:drawing>
-              <wp:anchor distT="0" distB="0" distL="0" distR="0" simplePos="0" relativeHeight="19" behindDoc="0" locked="0" layoutInCell="0" allowOverlap="1">
+              <wp:anchor distT="0" distB="0" distL="0" distR="0" simplePos="0" relativeHeight="20" behindDoc="0" locked="0" layoutInCell="0" allowOverlap="1">
                 <wp:simplePos x="0" y="0"/>
                 <wp:positionH relativeFrom="column">
                   <wp:align>center</wp:align>
@@ -499,7 +469,19 @@
         <w:rPr>
           <w:lang w:val="en-GB"/>
         </w:rPr>
-        <w:t>Inspection of the data set shows multiple issues such as columns with high missing data, duplicate records, and formats, like age ranges, that cannot  be used directly by a machine learning model. Figure 2 shows columns most impacted by missing data.</w:t>
+        <w:t xml:space="preserve">Inspection of the dataset shows columns with high missing data, duplicate records, and age ranges that </w:t>
+      </w:r>
+      <w:r>
+        <w:rPr>
+          <w:lang w:val="en-GB"/>
+        </w:rPr>
+        <w:t>are not applicable for</w:t>
+      </w:r>
+      <w:r>
+        <w:rPr>
+          <w:lang w:val="en-GB"/>
+        </w:rPr>
+        <w:t xml:space="preserve"> machine learning. Figure 2 shows columns most impacted by missing data.</w:t>
       </w:r>
     </w:p>
     <w:p>
@@ -784,7 +766,19 @@
         <w:rPr>
           <w:lang w:val="en-GB"/>
         </w:rPr>
-        <w:t>Two categories of record are not suitable for analysing readmission, and are removed. First, 1,652 patients discharged as deceased (discharge_disposition_ids of 11, 19 and 20) cannot be readmitted. Second, the dataset contains multiple records per patient. Including the same patient would cause data leakage when training models, as patterns for that patient may be memorised by the model across different training/test sets. Only the first encounter per patient is kept, sorted by encounter_id:</w:t>
+        <w:t xml:space="preserve">First, 1,652 patients discharged as deceased cannot be readmitted. Second, the dataset contains multiple records per patient. Including the same patient </w:t>
+      </w:r>
+      <w:r>
+        <w:rPr>
+          <w:lang w:val="en-GB"/>
+        </w:rPr>
+        <w:t>multiple times c</w:t>
+      </w:r>
+      <w:r>
+        <w:rPr>
+          <w:lang w:val="en-GB"/>
+        </w:rPr>
+        <w:t>ould cause data leakage when training models, as patterns may be memorised by the model across different training/test sets. Only the first encounter per patient is kept, sorted by encounter_id:</w:t>
       </w:r>
     </w:p>
     <w:p>
@@ -807,7 +801,7 @@
         <mc:AlternateContent>
           <mc:Choice Requires="wps">
             <w:drawing>
-              <wp:anchor distT="0" distB="0" distL="0" distR="0" simplePos="0" relativeHeight="21" behindDoc="0" locked="0" layoutInCell="0" allowOverlap="1">
+              <wp:anchor distT="0" distB="0" distL="0" distR="0" simplePos="0" relativeHeight="22" behindDoc="0" locked="0" layoutInCell="0" allowOverlap="1">
                 <wp:simplePos x="0" y="0"/>
                 <wp:positionH relativeFrom="column">
                   <wp:posOffset>0</wp:posOffset>
@@ -1084,7 +1078,7 @@
         <w:rPr>
           <w:lang w:val="en-GB"/>
         </w:rPr>
-        <w:t>The weight column (96.9% missing) cannot be meaningfully imputed. The medical_specialty column (49.1% missing) overlaps with ICD-9 diagnosis categories. The payer_code column (39.6% missing) records insurance type, which has no relevance to 30-day readmission.</w:t>
+        <w:t>Columns with high-missingness are dropped, as shown in Figure 4. This is because they cannot be meaningfully imputed, without skewing data.</w:t>
       </w:r>
     </w:p>
     <w:p>
@@ -1107,7 +1101,7 @@
         <mc:AlternateContent>
           <mc:Choice Requires="wps">
             <w:drawing>
-              <wp:anchor distT="0" distB="0" distL="0" distR="0" simplePos="0" relativeHeight="23" behindDoc="0" locked="0" layoutInCell="0" allowOverlap="1">
+              <wp:anchor distT="0" distB="0" distL="0" distR="0" simplePos="0" relativeHeight="24" behindDoc="0" locked="0" layoutInCell="0" allowOverlap="1">
                 <wp:simplePos x="0" y="0"/>
                 <wp:positionH relativeFrom="column">
                   <wp:align>center</wp:align>
@@ -1384,7 +1378,37 @@
         <w:rPr>
           <w:lang w:val="en-GB"/>
         </w:rPr>
-        <w:t>Several columns require encoding to be suitable for later model training. The following are examples of encoding performed in this project:</w:t>
+        <w:t xml:space="preserve">Several </w:t>
+      </w:r>
+      <w:r>
+        <w:rPr>
+          <w:lang w:val="en-GB"/>
+        </w:rPr>
+        <w:t>featues</w:t>
+      </w:r>
+      <w:r>
+        <w:rPr>
+          <w:lang w:val="en-GB"/>
+        </w:rPr>
+        <w:t xml:space="preserve"> require encoding to be suitable for later model training. </w:t>
+      </w:r>
+      <w:r>
+        <w:rPr>
+          <w:lang w:val="en-GB"/>
+        </w:rPr>
+        <w:t>E</w:t>
+      </w:r>
+      <w:r>
+        <w:rPr>
+          <w:lang w:val="en-GB"/>
+        </w:rPr>
+        <w:t xml:space="preserve">xamples of encoding performed in this project </w:t>
+      </w:r>
+      <w:r>
+        <w:rPr>
+          <w:lang w:val="en-GB"/>
+        </w:rPr>
+        <w:t>are described below.</w:t>
       </w:r>
     </w:p>
     <w:p>
@@ -1420,7 +1444,7 @@
         <w:rPr>
           <w:lang w:val="en-GB"/>
         </w:rPr>
-        <w:t>Gender is binary-encoded, and 3 unknown/invalid records are recoded to Female</w:t>
+        <w:t>Gender is binary-encoded. 3 unknown/invalid records are recoded to Female</w:t>
       </w:r>
     </w:p>
     <w:p>
@@ -1438,7 +1462,19 @@
         <w:rPr>
           <w:lang w:val="en-GB"/>
         </w:rPr>
-        <w:t xml:space="preserve">The recoding to female is arbitrary, and since only three records are imputed, it has no impact. </w:t>
+        <w:t xml:space="preserve">The recoding to female is arbitrary, and since three records are imputed, it </w:t>
+      </w:r>
+      <w:r>
+        <w:rPr>
+          <w:lang w:val="en-GB"/>
+        </w:rPr>
+        <w:t>does not skew data</w:t>
+      </w:r>
+      <w:r>
+        <w:rPr>
+          <w:lang w:val="en-GB"/>
+        </w:rPr>
+        <w:t xml:space="preserve"> </w:t>
       </w:r>
     </w:p>
     <w:p>
@@ -1492,7 +1528,37 @@
         <w:rPr>
           <w:lang w:val="en-GB"/>
         </w:rPr>
-        <w:t>These are grouped into nine clinical categories rather than label-encoded to avoid implying a false ordering between unrelated disease groups</w:t>
+        <w:t xml:space="preserve">These are grouped into </w:t>
+      </w:r>
+      <w:r>
+        <w:rPr>
+          <w:lang w:val="en-GB"/>
+        </w:rPr>
+        <w:t>9</w:t>
+      </w:r>
+      <w:r>
+        <w:rPr>
+          <w:lang w:val="en-GB"/>
+        </w:rPr>
+        <w:t xml:space="preserve"> clinical categories rather than label-encoded,</w:t>
+      </w:r>
+      <w:r>
+        <w:rPr>
+          <w:lang w:val="en-GB"/>
+        </w:rPr>
+        <w:t>avoiding</w:t>
+      </w:r>
+      <w:r>
+        <w:rPr>
+          <w:lang w:val="en-GB"/>
+        </w:rPr>
+        <w:t xml:space="preserve"> implying a false ordering between unrelated </w:t>
+      </w:r>
+      <w:r>
+        <w:rPr>
+          <w:lang w:val="en-GB"/>
+        </w:rPr>
+        <w:t>diagnosis groups</w:t>
       </w:r>
     </w:p>
     <w:p>
@@ -1520,7 +1586,91 @@
         <w:rPr>
           <w:lang w:val="en-GB"/>
         </w:rPr>
-        <w:t>1. Each age range is mapped to its midpoint, so '[60-70)' becomes 65, giving the model a continuous numeric value.</w:t>
+        <w:t xml:space="preserve">1. </w:t>
+      </w:r>
+      <w:r>
+        <w:rPr>
+          <w:lang w:val="en-GB"/>
+        </w:rPr>
+        <w:t>Ag</w:t>
+      </w:r>
+      <w:r>
+        <w:rPr>
+          <w:lang w:val="en-GB"/>
+        </w:rPr>
+        <w:t>e range</w:t>
+      </w:r>
+      <w:r>
+        <w:rPr>
+          <w:lang w:val="en-GB"/>
+        </w:rPr>
+        <w:t>s are</w:t>
+      </w:r>
+      <w:r>
+        <w:rPr>
+          <w:lang w:val="en-GB"/>
+        </w:rPr>
+        <w:t xml:space="preserve"> mapped to </w:t>
+      </w:r>
+      <w:r>
+        <w:rPr>
+          <w:lang w:val="en-GB"/>
+        </w:rPr>
+        <w:t>their</w:t>
+      </w:r>
+      <w:r>
+        <w:rPr>
+          <w:lang w:val="en-GB"/>
+        </w:rPr>
+        <w:t xml:space="preserve"> midpoint</w:t>
+      </w:r>
+      <w:r>
+        <w:rPr>
+          <w:lang w:val="en-GB"/>
+        </w:rPr>
+        <w:t>s.</w:t>
+      </w:r>
+      <w:r>
+        <w:rPr>
+          <w:lang w:val="en-GB"/>
+        </w:rPr>
+        <w:t xml:space="preserve"> </w:t>
+      </w:r>
+      <w:r>
+        <w:rPr>
+          <w:lang w:val="en-GB"/>
+        </w:rPr>
+        <w:t>For example,</w:t>
+      </w:r>
+      <w:r>
+        <w:rPr>
+          <w:lang w:val="en-GB"/>
+        </w:rPr>
+        <w:t xml:space="preserve"> '[60-70)' becomes 65, </w:t>
+      </w:r>
+      <w:r>
+        <w:rPr>
+          <w:lang w:val="en-GB"/>
+        </w:rPr>
+        <w:t>providing</w:t>
+      </w:r>
+      <w:r>
+        <w:rPr>
+          <w:lang w:val="en-GB"/>
+        </w:rPr>
+        <w:t xml:space="preserve"> a </w:t>
+      </w:r>
+      <w:r>
+        <w:rPr>
+          <w:lang w:val="en-GB"/>
+        </w:rPr>
+        <w:t>s</w:t>
+      </w:r>
+      <w:r>
+        <w:rPr>
+          <w:lang w:val="en-GB"/>
+        </w:rPr>
+        <w:t xml:space="preserve"> numeric value.</w:t>
       </w:r>
     </w:p>
     <w:p>
@@ -1543,7 +1693,7 @@
         <mc:AlternateContent>
           <mc:Choice Requires="wps">
             <w:drawing>
-              <wp:anchor distT="0" distB="0" distL="0" distR="0" simplePos="0" relativeHeight="25" behindDoc="0" locked="0" layoutInCell="0" allowOverlap="1">
+              <wp:anchor distT="0" distB="0" distL="0" distR="0" simplePos="0" relativeHeight="26" behindDoc="0" locked="0" layoutInCell="0" allowOverlap="1">
                 <wp:simplePos x="0" y="0"/>
                 <wp:positionH relativeFrom="column">
                   <wp:posOffset>8255</wp:posOffset>
@@ -1861,7 +2011,7 @@
         <mc:AlternateContent>
           <mc:Choice Requires="wps">
             <w:drawing>
-              <wp:anchor distT="0" distB="0" distL="0" distR="0" simplePos="0" relativeHeight="27" behindDoc="0" locked="0" layoutInCell="0" allowOverlap="1">
+              <wp:anchor distT="0" distB="0" distL="0" distR="0" simplePos="0" relativeHeight="28" behindDoc="0" locked="0" layoutInCell="0" allowOverlap="1">
                 <wp:simplePos x="0" y="0"/>
                 <wp:positionH relativeFrom="column">
                   <wp:align>center</wp:align>
@@ -2162,7 +2312,7 @@
         <mc:AlternateContent>
           <mc:Choice Requires="wps">
             <w:drawing>
-              <wp:anchor distT="0" distB="0" distL="0" distR="0" simplePos="0" relativeHeight="29" behindDoc="0" locked="0" layoutInCell="0" allowOverlap="1">
+              <wp:anchor distT="0" distB="0" distL="0" distR="0" simplePos="0" relativeHeight="30" behindDoc="0" locked="0" layoutInCell="0" allowOverlap="1">
                 <wp:simplePos x="0" y="0"/>
                 <wp:positionH relativeFrom="column">
                   <wp:align>center</wp:align>
@@ -2424,46 +2574,41 @@
         </w:rPr>
       </w:pPr>
       <w:r>
+        <w:rPr>
+          <w:lang w:val="en-GB"/>
+        </w:rPr>
+        <w:br/>
+      </w:r>
+      <w:r>
         <mc:AlternateContent>
           <mc:Choice Requires="wps">
             <w:drawing>
-              <wp:anchor distT="0" distB="0" distL="0" distR="0" simplePos="0" relativeHeight="31" behindDoc="0" locked="0" layoutInCell="0" allowOverlap="1">
+              <wp:anchor distT="0" distB="0" distL="0" distR="0" simplePos="0" relativeHeight="73" behindDoc="0" locked="0" layoutInCell="0" allowOverlap="1">
                 <wp:simplePos x="0" y="0"/>
                 <wp:positionH relativeFrom="column">
-                  <wp:align>center</wp:align>
+                  <wp:posOffset>-165735</wp:posOffset>
                 </wp:positionH>
                 <wp:positionV relativeFrom="paragraph">
-                  <wp:posOffset>635</wp:posOffset>
+                  <wp:posOffset>-151130</wp:posOffset>
                 </wp:positionV>
-                <wp:extent cx="5640070" cy="259080"/>
+                <wp:extent cx="5972175" cy="549910"/>
                 <wp:effectExtent l="0" t="0" r="0" b="0"/>
-                <wp:wrapSquare wrapText="largest"/>
+                <wp:wrapSquare wrapText="right"/>
                 <wp:docPr id="22" name="Frame8"/>
                 <a:graphic xmlns:a="http://schemas.openxmlformats.org/drawingml/2006/main">
                   <a:graphicData uri="http://schemas.microsoft.com/office/word/2010/wordprocessingShape">
                     <wps:wsp>
-                      <wps:cNvSpPr/>
+                      <wps:cNvSpPr txBox="1"/>
                       <wps:spPr>
                         <a:xfrm>
                           <a:off x="0" y="0"/>
-                          <a:ext cx="5640120" cy="259200"/>
+                          <a:ext cx="5972175" cy="549910"/>
                         </a:xfrm>
-                        <a:prstGeom prst="rect">
-                          <a:avLst/>
-                        </a:prstGeom>
+                        <a:prstGeom prst="rect"/>
                         <a:solidFill>
                           <a:srgbClr val="FFFFFF"/>
                         </a:solidFill>
-                        <a:ln w="0">
-                          <a:noFill/>
-                        </a:ln>
                       </wps:spPr>
-                      <wps:style>
-                        <a:lnRef idx="0"/>
-                        <a:fillRef idx="0"/>
-                        <a:effectRef idx="0"/>
-                        <a:fontRef idx="minor"/>
-                      </wps:style>
                       <wps:txbx>
                         <w:txbxContent>
                           <w:p>
@@ -2471,15 +2616,13 @@
                               <w:pStyle w:val="Figure"/>
                               <w:spacing w:before="0" w:after="200"/>
                               <w:jc w:val="center"/>
-                              <w:rPr>
-                                <w:lang w:val="en-GB"/>
-                              </w:rPr>
+                              <w:rPr/>
                             </w:pPr>
                             <w:r>
                               <w:rPr/>
                               <w:drawing>
                                 <wp:inline distT="0" distB="0" distL="0" distR="0">
-                                  <wp:extent cx="5972810" cy="412115"/>
+                                  <wp:extent cx="5972175" cy="410210"/>
                                   <wp:effectExtent l="0" t="0" r="0" b="0"/>
                                   <wp:docPr id="23" name="Image7"/>
                                   <wp:cNvGraphicFramePr>
@@ -2504,7 +2647,7 @@
                                         <pic:spPr bwMode="auto">
                                           <a:xfrm>
                                             <a:off x="0" y="0"/>
-                                            <a:ext cx="5972810" cy="412115"/>
+                                            <a:ext cx="5972175" cy="410210"/>
                                           </a:xfrm>
                                           <a:prstGeom prst="rect">
                                             <a:avLst/>
@@ -2516,53 +2659,36 @@
                                   </a:graphic>
                                 </wp:inline>
                               </w:drawing>
-                            </w:r>
-                            <w:r>
-                              <w:rPr>
-                                <w:lang w:val="en-GB"/>
-                              </w:rPr>
                               <w:t xml:space="preserve">Figure </w:t>
                             </w:r>
                             <w:r>
-                              <w:rPr>
-                                <w:lang w:val="en-GB"/>
-                              </w:rPr>
+                              <w:rPr/>
                               <w:fldChar w:fldCharType="begin"/>
                             </w:r>
                             <w:r>
-                              <w:rPr>
-                                <w:lang w:val="en-GB"/>
-                              </w:rPr>
+                              <w:rPr/>
                               <w:instrText xml:space="preserve"> SEQ Figure \* ARABIC </w:instrText>
                             </w:r>
                             <w:r>
-                              <w:rPr>
-                                <w:lang w:val="en-GB"/>
-                              </w:rPr>
+                              <w:rPr/>
                               <w:fldChar w:fldCharType="separate"/>
                             </w:r>
                             <w:r>
-                              <w:rPr>
-                                <w:lang w:val="en-GB"/>
-                              </w:rPr>
+                              <w:rPr/>
                               <w:t>8</w:t>
                             </w:r>
                             <w:r>
-                              <w:rPr>
-                                <w:lang w:val="en-GB"/>
-                              </w:rPr>
+                              <w:rPr/>
                               <w:fldChar w:fldCharType="end"/>
                             </w:r>
                             <w:r>
-                              <w:rPr>
-                                <w:lang w:val="en-GB"/>
-                              </w:rPr>
-                              <w:t>: Encoding of Gender and Race</w:t>
+                              <w:rPr/>
+                              <w:t>: Encoding of Race and Gender</w:t>
                             </w:r>
                           </w:p>
                         </w:txbxContent>
                       </wps:txbx>
-                      <wps:bodyPr lIns="0" tIns="0" rIns="0" bIns="0" anchor="t">
+                      <wps:bodyPr anchor="t" lIns="0" tIns="0" rIns="0" bIns="0">
                         <a:noAutofit/>
                       </wps:bodyPr>
                     </wps:wsp>
@@ -2573,25 +2699,21 @@
           </mc:Choice>
           <mc:Fallback>
             <w:pict>
-              <v:rect id="shape_0" fillcolor="white" stroked="f" o:allowincell="f" style="position:absolute;margin-left:13.1pt;margin-top:0.05pt;width:444.05pt;height:20.35pt;mso-wrap-style:square;v-text-anchor:top;mso-position-horizontal:center">
-                <v:fill o:detectmouseclick="t" type="solid" color2="black"/>
-                <v:stroke color="#3465a4" joinstyle="round" endcap="flat"/>
-                <v:textbox>
+              <v:rect style="position:absolute;rotation:-0;width:470.25pt;height:43.3pt;mso-wrap-distance-left:0pt;mso-wrap-distance-right:0pt;mso-wrap-distance-top:0pt;mso-wrap-distance-bottom:0pt;margin-top:-11.9pt;mso-position-vertical-relative:text;margin-left:-13.05pt;mso-position-horizontal-relative:text">
+                <v:textbox inset="0in,0in,0in,0in">
                   <w:txbxContent>
                     <w:p>
                       <w:pPr>
                         <w:pStyle w:val="Figure"/>
                         <w:spacing w:before="0" w:after="200"/>
                         <w:jc w:val="center"/>
-                        <w:rPr>
-                          <w:lang w:val="en-GB"/>
-                        </w:rPr>
+                        <w:rPr/>
                       </w:pPr>
                       <w:r>
                         <w:rPr/>
                         <w:drawing>
                           <wp:inline distT="0" distB="0" distL="0" distR="0">
-                            <wp:extent cx="5972810" cy="412115"/>
+                            <wp:extent cx="5972175" cy="410210"/>
                             <wp:effectExtent l="0" t="0" r="0" b="0"/>
                             <wp:docPr id="24" name="Image7"/>
                             <wp:cNvGraphicFramePr>
@@ -2616,7 +2738,7 @@
                                   <pic:spPr bwMode="auto">
                                     <a:xfrm>
                                       <a:off x="0" y="0"/>
-                                      <a:ext cx="5972810" cy="412115"/>
+                                      <a:ext cx="5972175" cy="410210"/>
                                     </a:xfrm>
                                     <a:prstGeom prst="rect">
                                       <a:avLst/>
@@ -2628,64 +2750,108 @@
                             </a:graphic>
                           </wp:inline>
                         </w:drawing>
-                      </w:r>
-                      <w:r>
-                        <w:rPr>
-                          <w:lang w:val="en-GB"/>
-                        </w:rPr>
                         <w:t xml:space="preserve">Figure </w:t>
                       </w:r>
                       <w:r>
-                        <w:rPr>
-                          <w:lang w:val="en-GB"/>
-                        </w:rPr>
+                        <w:rPr/>
                         <w:fldChar w:fldCharType="begin"/>
                       </w:r>
                       <w:r>
-                        <w:rPr>
-                          <w:lang w:val="en-GB"/>
-                        </w:rPr>
+                        <w:rPr/>
                         <w:instrText xml:space="preserve"> SEQ Figure \* ARABIC </w:instrText>
                       </w:r>
                       <w:r>
-                        <w:rPr>
-                          <w:lang w:val="en-GB"/>
-                        </w:rPr>
+                        <w:rPr/>
                         <w:fldChar w:fldCharType="separate"/>
                       </w:r>
                       <w:r>
-                        <w:rPr>
-                          <w:lang w:val="en-GB"/>
-                        </w:rPr>
+                        <w:rPr/>
                         <w:t>8</w:t>
                       </w:r>
                       <w:r>
-                        <w:rPr>
-                          <w:lang w:val="en-GB"/>
-                        </w:rPr>
+                        <w:rPr/>
                         <w:fldChar w:fldCharType="end"/>
                       </w:r>
                       <w:r>
-                        <w:rPr>
-                          <w:lang w:val="en-GB"/>
-                        </w:rPr>
-                        <w:t>: Encoding of Gender and Race</w:t>
+                        <w:rPr/>
+                        <w:t>: Encoding of Race and Gender</w:t>
                       </w:r>
                     </w:p>
                   </w:txbxContent>
                 </v:textbox>
-                <w10:wrap type="square" side="largest"/>
+                <w10:wrap type="square" side="right"/>
               </v:rect>
             </w:pict>
           </mc:Fallback>
         </mc:AlternateContent>
       </w:r>
-      <w:r>
-        <w:rPr>
-          <w:lang w:val="en-GB"/>
-        </w:rPr>
-        <w:br/>
-        <w:t>3. For the two sparse lab-result columns (A1Cresult: 83.3% missing; max_glu_serum: 94.7% missing), a missing value is clinically meaningful. A patient whose HbA1c (blood-sugar levels over 2-3 months) was never tested during admission is likely less closely monitored than one with a recorded result. Encoding 'not tested' as a distinct category (0) preserves this  rather than imputing a value. The full scale is None=0, Normal=1, slightly elevated=2, highly elevated=3.</w:t>
+    </w:p>
+    <w:p>
+      <w:pPr>
+        <w:pStyle w:val="Normal"/>
+        <w:rPr>
+          <w:lang w:val="en-GB"/>
+        </w:rPr>
+      </w:pPr>
+      <w:r>
+        <w:rPr>
+          <w:lang w:val="en-GB"/>
+        </w:rPr>
+        <w:t xml:space="preserve">3. For </w:t>
+      </w:r>
+      <w:r>
+        <w:rPr>
+          <w:lang w:val="en-GB"/>
+        </w:rPr>
+        <w:t>high-missing</w:t>
+      </w:r>
+      <w:r>
+        <w:rPr>
+          <w:lang w:val="en-GB"/>
+        </w:rPr>
+        <w:t xml:space="preserve"> lab-result columns (A1Cresult: 83.3% missing; max_glu_serum: 94.7% missing), a missing value </w:t>
+      </w:r>
+      <w:r>
+        <w:rPr>
+          <w:lang w:val="en-GB"/>
+        </w:rPr>
+        <w:t>may be</w:t>
+      </w:r>
+      <w:r>
+        <w:rPr>
+          <w:lang w:val="en-GB"/>
+        </w:rPr>
+        <w:t xml:space="preserve"> meaningful. A patient whose HbA1c (blood-sugar levels over 2-3 months) was never tested is likely less closely monitored than </w:t>
+      </w:r>
+      <w:r>
+        <w:rPr>
+          <w:lang w:val="en-GB"/>
+        </w:rPr>
+        <w:t>those</w:t>
+      </w:r>
+      <w:r>
+        <w:rPr>
+          <w:lang w:val="en-GB"/>
+        </w:rPr>
+        <w:t xml:space="preserve"> with recorded result</w:t>
+      </w:r>
+      <w:r>
+        <w:rPr>
+          <w:lang w:val="en-GB"/>
+        </w:rPr>
+        <w:t>s</w:t>
+      </w:r>
+      <w:r>
+        <w:rPr>
+          <w:lang w:val="en-GB"/>
+        </w:rPr>
+        <w:t xml:space="preserve">. Encoding 'not tested' as a distinct category preserves this, rather than imputing a value. </w:t>
+      </w:r>
+      <w:r>
+        <w:rPr>
+          <w:lang w:val="en-GB"/>
+        </w:rPr>
+        <w:t>See Figure 9.</w:t>
       </w:r>
     </w:p>
     <w:p>
@@ -2702,7 +2868,7 @@
         <mc:AlternateContent>
           <mc:Choice Requires="wps">
             <w:drawing>
-              <wp:anchor distT="0" distB="0" distL="0" distR="0" simplePos="0" relativeHeight="33" behindDoc="0" locked="0" layoutInCell="0" allowOverlap="1">
+              <wp:anchor distT="0" distB="0" distL="0" distR="0" simplePos="0" relativeHeight="32" behindDoc="0" locked="0" layoutInCell="0" allowOverlap="1">
                 <wp:simplePos x="0" y="0"/>
                 <wp:positionH relativeFrom="column">
                   <wp:align>center</wp:align>
@@ -2978,7 +3144,7 @@
         <mc:AlternateContent>
           <mc:Choice Requires="wps">
             <w:drawing>
-              <wp:anchor distT="0" distB="0" distL="0" distR="0" simplePos="0" relativeHeight="35" behindDoc="0" locked="0" layoutInCell="0" allowOverlap="1">
+              <wp:anchor distT="0" distB="0" distL="0" distR="0" simplePos="0" relativeHeight="34" behindDoc="0" locked="0" layoutInCell="0" allowOverlap="1">
                 <wp:simplePos x="0" y="0"/>
                 <wp:positionH relativeFrom="column">
                   <wp:align>center</wp:align>
@@ -3234,7 +3400,322 @@
           <w:lang w:val="en-GB"/>
         </w:rPr>
         <w:br/>
-        <w:t>4. All 23 medication columns share the same scale. 0 = not prescribed, 1 = dose unchanged, 2 = increased, 3 = decreased. Missing values default to 0.</w:t>
+        <w:t xml:space="preserve">4. All 23 medication columns share the same scale. </w:t>
+      </w:r>
+      <w:r>
+        <w:rPr>
+          <w:lang w:val="en-GB"/>
+        </w:rPr>
+        <w:t>See Table 1 and Figure 11.</w:t>
+      </w:r>
+    </w:p>
+    <w:tbl>
+      <w:tblPr>
+        <w:tblW w:w="5000" w:type="pct"/>
+        <w:jc w:val="start"/>
+        <w:tblInd w:w="55" w:type="dxa"/>
+        <w:tblLayout w:type="fixed"/>
+        <w:tblCellMar>
+          <w:top w:w="55" w:type="dxa"/>
+          <w:start w:w="55" w:type="dxa"/>
+          <w:bottom w:w="55" w:type="dxa"/>
+          <w:end w:w="55" w:type="dxa"/>
+        </w:tblCellMar>
+      </w:tblPr>
+      <w:tblGrid>
+        <w:gridCol w:w="4703"/>
+        <w:gridCol w:w="4703"/>
+      </w:tblGrid>
+      <w:tr>
+        <w:trPr>
+          <w:tblHeader w:val="true"/>
+        </w:trPr>
+        <w:tc>
+          <w:tcPr>
+            <w:tcW w:w="4703" w:type="dxa"/>
+            <w:tcBorders>
+              <w:top w:val="single" w:sz="4" w:space="0" w:color="000000"/>
+              <w:start w:val="single" w:sz="4" w:space="0" w:color="000000"/>
+              <w:bottom w:val="single" w:sz="4" w:space="0" w:color="000000"/>
+            </w:tcBorders>
+          </w:tcPr>
+          <w:p>
+            <w:pPr>
+              <w:pStyle w:val="TableContents"/>
+              <w:keepNext w:val="true"/>
+              <w:spacing w:before="0" w:after="200"/>
+              <w:jc w:val="center"/>
+              <w:rPr>
+                <w:b/>
+                <w:bCs/>
+              </w:rPr>
+            </w:pPr>
+            <w:r>
+              <w:rPr>
+                <w:b/>
+                <w:bCs/>
+              </w:rPr>
+              <w:t>Value</w:t>
+            </w:r>
+          </w:p>
+        </w:tc>
+        <w:tc>
+          <w:tcPr>
+            <w:tcW w:w="4703" w:type="dxa"/>
+            <w:tcBorders>
+              <w:top w:val="single" w:sz="4" w:space="0" w:color="000000"/>
+              <w:start w:val="single" w:sz="4" w:space="0" w:color="000000"/>
+              <w:bottom w:val="single" w:sz="4" w:space="0" w:color="000000"/>
+              <w:end w:val="single" w:sz="4" w:space="0" w:color="000000"/>
+            </w:tcBorders>
+          </w:tcPr>
+          <w:p>
+            <w:pPr>
+              <w:pStyle w:val="TableContents"/>
+              <w:spacing w:before="0" w:after="200"/>
+              <w:jc w:val="center"/>
+              <w:rPr>
+                <w:b/>
+                <w:bCs/>
+              </w:rPr>
+            </w:pPr>
+            <w:r>
+              <w:rPr>
+                <w:b/>
+                <w:bCs/>
+              </w:rPr>
+              <w:t>Meaning</w:t>
+            </w:r>
+          </w:p>
+        </w:tc>
+      </w:tr>
+      <w:tr>
+        <w:trPr/>
+        <w:tc>
+          <w:tcPr>
+            <w:tcW w:w="4703" w:type="dxa"/>
+            <w:tcBorders>
+              <w:start w:val="single" w:sz="4" w:space="0" w:color="000000"/>
+              <w:bottom w:val="single" w:sz="4" w:space="0" w:color="000000"/>
+            </w:tcBorders>
+          </w:tcPr>
+          <w:p>
+            <w:pPr>
+              <w:pStyle w:val="TableContents"/>
+              <w:keepNext w:val="true"/>
+              <w:spacing w:before="0" w:after="200"/>
+              <w:rPr/>
+            </w:pPr>
+            <w:r>
+              <w:rPr/>
+              <w:t>0</w:t>
+            </w:r>
+          </w:p>
+        </w:tc>
+        <w:tc>
+          <w:tcPr>
+            <w:tcW w:w="4703" w:type="dxa"/>
+            <w:tcBorders>
+              <w:start w:val="single" w:sz="4" w:space="0" w:color="000000"/>
+              <w:bottom w:val="single" w:sz="4" w:space="0" w:color="000000"/>
+              <w:end w:val="single" w:sz="4" w:space="0" w:color="000000"/>
+            </w:tcBorders>
+          </w:tcPr>
+          <w:p>
+            <w:pPr>
+              <w:pStyle w:val="TableContents"/>
+              <w:spacing w:before="0" w:after="200"/>
+              <w:rPr/>
+            </w:pPr>
+            <w:r>
+              <w:rPr/>
+              <w:t>Not prescribed. Missing values default to 0.</w:t>
+            </w:r>
+          </w:p>
+        </w:tc>
+      </w:tr>
+      <w:tr>
+        <w:trPr/>
+        <w:tc>
+          <w:tcPr>
+            <w:tcW w:w="4703" w:type="dxa"/>
+            <w:tcBorders>
+              <w:start w:val="single" w:sz="4" w:space="0" w:color="000000"/>
+              <w:bottom w:val="single" w:sz="4" w:space="0" w:color="000000"/>
+            </w:tcBorders>
+          </w:tcPr>
+          <w:p>
+            <w:pPr>
+              <w:pStyle w:val="TableContents"/>
+              <w:keepNext w:val="true"/>
+              <w:spacing w:before="0" w:after="200"/>
+              <w:rPr/>
+            </w:pPr>
+            <w:r>
+              <w:rPr/>
+              <w:t>1</w:t>
+            </w:r>
+          </w:p>
+        </w:tc>
+        <w:tc>
+          <w:tcPr>
+            <w:tcW w:w="4703" w:type="dxa"/>
+            <w:tcBorders>
+              <w:start w:val="single" w:sz="4" w:space="0" w:color="000000"/>
+              <w:bottom w:val="single" w:sz="4" w:space="0" w:color="000000"/>
+              <w:end w:val="single" w:sz="4" w:space="0" w:color="000000"/>
+            </w:tcBorders>
+          </w:tcPr>
+          <w:p>
+            <w:pPr>
+              <w:pStyle w:val="TableContents"/>
+              <w:spacing w:before="0" w:after="200"/>
+              <w:rPr/>
+            </w:pPr>
+            <w:r>
+              <w:rPr/>
+              <w:t>Dose unchanged.</w:t>
+            </w:r>
+          </w:p>
+        </w:tc>
+      </w:tr>
+      <w:tr>
+        <w:trPr/>
+        <w:tc>
+          <w:tcPr>
+            <w:tcW w:w="4703" w:type="dxa"/>
+            <w:tcBorders>
+              <w:start w:val="single" w:sz="4" w:space="0" w:color="000000"/>
+              <w:bottom w:val="single" w:sz="4" w:space="0" w:color="000000"/>
+            </w:tcBorders>
+          </w:tcPr>
+          <w:p>
+            <w:pPr>
+              <w:pStyle w:val="TableContents"/>
+              <w:keepNext w:val="true"/>
+              <w:spacing w:before="0" w:after="200"/>
+              <w:rPr/>
+            </w:pPr>
+            <w:r>
+              <w:rPr/>
+              <w:t>2</w:t>
+            </w:r>
+          </w:p>
+        </w:tc>
+        <w:tc>
+          <w:tcPr>
+            <w:tcW w:w="4703" w:type="dxa"/>
+            <w:tcBorders>
+              <w:start w:val="single" w:sz="4" w:space="0" w:color="000000"/>
+              <w:bottom w:val="single" w:sz="4" w:space="0" w:color="000000"/>
+              <w:end w:val="single" w:sz="4" w:space="0" w:color="000000"/>
+            </w:tcBorders>
+          </w:tcPr>
+          <w:p>
+            <w:pPr>
+              <w:pStyle w:val="TableContents"/>
+              <w:spacing w:before="0" w:after="200"/>
+              <w:rPr/>
+            </w:pPr>
+            <w:r>
+              <w:rPr/>
+              <w:t>Dose increased.</w:t>
+            </w:r>
+          </w:p>
+        </w:tc>
+      </w:tr>
+      <w:tr>
+        <w:trPr/>
+        <w:tc>
+          <w:tcPr>
+            <w:tcW w:w="4703" w:type="dxa"/>
+            <w:tcBorders>
+              <w:start w:val="single" w:sz="4" w:space="0" w:color="000000"/>
+              <w:bottom w:val="single" w:sz="4" w:space="0" w:color="000000"/>
+            </w:tcBorders>
+          </w:tcPr>
+          <w:p>
+            <w:pPr>
+              <w:pStyle w:val="TableContents"/>
+              <w:keepNext w:val="true"/>
+              <w:spacing w:before="0" w:after="200"/>
+              <w:rPr/>
+            </w:pPr>
+            <w:r>
+              <w:rPr/>
+              <w:t>3</w:t>
+            </w:r>
+          </w:p>
+        </w:tc>
+        <w:tc>
+          <w:tcPr>
+            <w:tcW w:w="4703" w:type="dxa"/>
+            <w:tcBorders>
+              <w:start w:val="single" w:sz="4" w:space="0" w:color="000000"/>
+              <w:bottom w:val="single" w:sz="4" w:space="0" w:color="000000"/>
+              <w:end w:val="single" w:sz="4" w:space="0" w:color="000000"/>
+            </w:tcBorders>
+          </w:tcPr>
+          <w:p>
+            <w:pPr>
+              <w:pStyle w:val="TableContents"/>
+              <w:spacing w:before="0" w:after="200"/>
+              <w:rPr/>
+            </w:pPr>
+            <w:r>
+              <w:rPr/>
+              <w:t>Dose decreased.</w:t>
+            </w:r>
+          </w:p>
+        </w:tc>
+      </w:tr>
+    </w:tbl>
+    <w:p>
+      <w:pPr>
+        <w:pStyle w:val="Table"/>
+        <w:jc w:val="center"/>
+        <w:rPr/>
+      </w:pPr>
+      <w:r>
+        <w:rPr/>
+        <w:t xml:space="preserve">Table </w:t>
+      </w:r>
+      <w:r>
+        <w:rPr/>
+        <w:fldChar w:fldCharType="begin"/>
+      </w:r>
+      <w:r>
+        <w:rPr/>
+        <w:instrText xml:space="preserve"> SEQ Table \* ARABIC </w:instrText>
+      </w:r>
+      <w:r>
+        <w:rPr/>
+        <w:fldChar w:fldCharType="separate"/>
+      </w:r>
+      <w:r>
+        <w:rPr/>
+        <w:t>1</w:t>
+      </w:r>
+      <w:r>
+        <w:rPr/>
+        <w:fldChar w:fldCharType="end"/>
+      </w:r>
+      <w:r>
+        <w:rPr/>
+        <w:t>: Medication Column Encodings</w:t>
+      </w:r>
+    </w:p>
+    <w:p>
+      <w:pPr>
+        <w:pStyle w:val="Normal"/>
+        <w:rPr>
+          <w:lang w:val="en-GB"/>
+        </w:rPr>
+      </w:pPr>
+      <w:r>
+        <w:rPr>
+          <w:lang w:val="en-GB"/>
+        </w:rPr>
       </w:r>
     </w:p>
     <w:p>
@@ -3251,7 +3732,7 @@
         <mc:AlternateContent>
           <mc:Choice Requires="wps">
             <w:drawing>
-              <wp:anchor distT="0" distB="0" distL="0" distR="0" simplePos="0" relativeHeight="37" behindDoc="0" locked="0" layoutInCell="0" allowOverlap="1">
+              <wp:anchor distT="0" distB="0" distL="0" distR="0" simplePos="0" relativeHeight="36" behindDoc="0" locked="0" layoutInCell="0" allowOverlap="1">
                 <wp:simplePos x="0" y="0"/>
                 <wp:positionH relativeFrom="column">
                   <wp:align>center</wp:align>
@@ -3540,7 +4021,49 @@
         <w:rPr>
           <w:lang w:val="en-GB"/>
         </w:rPr>
-        <w:t>5. The below function maps each numeric ICD-9 code to one of nine categories using numeric ranges. All three diagnosis columns are processed the same way, then ordinal-encoded using DIAG_CAT_MAP.</w:t>
+        <w:t xml:space="preserve">5. </w:t>
+      </w:r>
+      <w:r>
+        <w:rPr>
+          <w:lang w:val="en-GB"/>
+        </w:rPr>
+        <w:t>E</w:t>
+      </w:r>
+      <w:r>
+        <w:rPr>
+          <w:lang w:val="en-GB"/>
+        </w:rPr>
+        <w:t xml:space="preserve">ach ICD-9 code </w:t>
+      </w:r>
+      <w:r>
+        <w:rPr>
+          <w:lang w:val="en-GB"/>
+        </w:rPr>
+        <w:t xml:space="preserve">is mapped </w:t>
+      </w:r>
+      <w:r>
+        <w:rPr>
+          <w:lang w:val="en-GB"/>
+        </w:rPr>
+        <w:t xml:space="preserve">to one of </w:t>
+      </w:r>
+      <w:r>
+        <w:rPr>
+          <w:lang w:val="en-GB"/>
+        </w:rPr>
+        <w:t>9</w:t>
+      </w:r>
+      <w:r>
+        <w:rPr>
+          <w:lang w:val="en-GB"/>
+        </w:rPr>
+        <w:t xml:space="preserve"> categories using numeric ranges. </w:t>
+      </w:r>
+      <w:r>
+        <w:rPr>
+          <w:lang w:val="en-GB"/>
+        </w:rPr>
+        <w:t>See Figures 12 and 13.</w:t>
       </w:r>
     </w:p>
     <w:p>
@@ -3820,7 +4343,7 @@
         <mc:AlternateContent>
           <mc:Choice Requires="wps">
             <w:drawing>
-              <wp:anchor distT="0" distB="0" distL="0" distR="0" simplePos="0" relativeHeight="42" behindDoc="0" locked="0" layoutInCell="0" allowOverlap="1">
+              <wp:anchor distT="0" distB="0" distL="0" distR="0" simplePos="0" relativeHeight="52" behindDoc="0" locked="0" layoutInCell="0" allowOverlap="1">
                 <wp:simplePos x="0" y="0"/>
                 <wp:positionH relativeFrom="column">
                   <wp:align>center</wp:align>
@@ -4076,7 +4599,19 @@
           <w:lang w:val="en-GB"/>
         </w:rPr>
         <w:br/>
-        <w:t>The dataset state before and after cleaning is shown in Figure 14.</w:t>
+        <w:t xml:space="preserve">Figure 14 </w:t>
+      </w:r>
+      <w:r>
+        <w:rPr>
+          <w:lang w:val="en-GB"/>
+        </w:rPr>
+        <w:t>shows t</w:t>
+      </w:r>
+      <w:r>
+        <w:rPr>
+          <w:lang w:val="en-GB"/>
+        </w:rPr>
+        <w:t>he dataset before and after cleaning.</w:t>
       </w:r>
     </w:p>
     <w:p>
@@ -4365,75 +4900,249 @@
       </w:pPr>
       <w:r>
         <w:rPr/>
-        <w:drawing>
-          <wp:inline distT="0" distB="0" distL="0" distR="0">
-            <wp:extent cx="5029200" cy="2755900"/>
-            <wp:effectExtent l="0" t="0" r="0" b="0"/>
-            <wp:docPr id="43" name="Picture 3"/>
-            <wp:cNvGraphicFramePr>
-              <a:graphicFrameLocks xmlns:a="http://schemas.openxmlformats.org/drawingml/2006/main" noChangeAspect="1"/>
-            </wp:cNvGraphicFramePr>
-            <a:graphic xmlns:a="http://schemas.openxmlformats.org/drawingml/2006/main">
-              <a:graphicData uri="http://schemas.openxmlformats.org/drawingml/2006/picture">
-                <pic:pic xmlns:pic="http://schemas.openxmlformats.org/drawingml/2006/picture">
-                  <pic:nvPicPr>
-                    <pic:cNvPr id="43" name="Picture 3"/>
-                    <pic:cNvPicPr>
-                      <a:picLocks noChangeAspect="1" noChangeArrowheads="1"/>
-                    </pic:cNvPicPr>
-                  </pic:nvPicPr>
-                  <pic:blipFill>
-                    <a:blip r:embed="rId30"/>
-                    <a:stretch>
-                      <a:fillRect/>
-                    </a:stretch>
-                  </pic:blipFill>
-                  <pic:spPr bwMode="auto">
-                    <a:xfrm>
-                      <a:off x="0" y="0"/>
-                      <a:ext cx="5029200" cy="2755900"/>
-                    </a:xfrm>
-                    <a:prstGeom prst="rect">
-                      <a:avLst/>
-                    </a:prstGeom>
-                    <a:noFill/>
-                  </pic:spPr>
-                </pic:pic>
-              </a:graphicData>
-            </a:graphic>
-          </wp:inline>
-        </w:drawing>
+      </w:r>
+      <w:r>
+        <mc:AlternateContent>
+          <mc:Choice Requires="wps">
+            <w:drawing>
+              <wp:inline distT="0" distB="0" distL="0" distR="0">
+                <wp:extent cx="5029200" cy="2895600"/>
+                <wp:effectExtent l="0" t="0" r="0" b="0"/>
+                <wp:docPr id="43" name="Frame25"/>
+                <a:graphic xmlns:a="http://schemas.openxmlformats.org/drawingml/2006/main">
+                  <a:graphicData uri="http://schemas.microsoft.com/office/word/2010/wordprocessingShape">
+                    <wps:wsp>
+                      <wps:cNvSpPr txBox="1"/>
+                      <wps:spPr>
+                        <a:xfrm>
+                          <a:off x="0" y="0"/>
+                          <a:ext cx="5029200" cy="2895600"/>
+                        </a:xfrm>
+                        <a:prstGeom prst="rect"/>
+                        <a:solidFill>
+                          <a:srgbClr val="FFFFFF"/>
+                        </a:solidFill>
+                      </wps:spPr>
+                      <wps:txbx>
+                        <w:txbxContent>
+                          <w:p>
+                            <w:pPr>
+                              <w:pStyle w:val="Figure"/>
+                              <w:spacing w:before="0" w:after="200"/>
+                              <w:jc w:val="center"/>
+                              <w:rPr/>
+                            </w:pPr>
+                            <w:r>
+                              <w:rPr/>
+                              <w:drawing>
+                                <wp:inline distT="0" distB="0" distL="0" distR="0">
+                                  <wp:extent cx="5029200" cy="2755900"/>
+                                  <wp:effectExtent l="0" t="0" r="0" b="0"/>
+                                  <wp:docPr id="44" name="Picture 3"/>
+                                  <wp:cNvGraphicFramePr>
+                                    <a:graphicFrameLocks xmlns:a="http://schemas.openxmlformats.org/drawingml/2006/main" noChangeAspect="1"/>
+                                  </wp:cNvGraphicFramePr>
+                                  <a:graphic xmlns:a="http://schemas.openxmlformats.org/drawingml/2006/main">
+                                    <a:graphicData uri="http://schemas.openxmlformats.org/drawingml/2006/picture">
+                                      <pic:pic xmlns:pic="http://schemas.openxmlformats.org/drawingml/2006/picture">
+                                        <pic:nvPicPr>
+                                          <pic:cNvPr id="44" name="Picture 3"/>
+                                          <pic:cNvPicPr>
+                                            <a:picLocks noChangeAspect="1" noChangeArrowheads="1"/>
+                                          </pic:cNvPicPr>
+                                        </pic:nvPicPr>
+                                        <pic:blipFill>
+                                          <a:blip r:embed="rId30"/>
+                                          <a:stretch>
+                                            <a:fillRect/>
+                                          </a:stretch>
+                                        </pic:blipFill>
+                                        <pic:spPr bwMode="auto">
+                                          <a:xfrm>
+                                            <a:off x="0" y="0"/>
+                                            <a:ext cx="5029200" cy="2755900"/>
+                                          </a:xfrm>
+                                          <a:prstGeom prst="rect">
+                                            <a:avLst/>
+                                          </a:prstGeom>
+                                          <a:noFill/>
+                                        </pic:spPr>
+                                      </pic:pic>
+                                    </a:graphicData>
+                                  </a:graphic>
+                                </wp:inline>
+                              </w:drawing>
+                              <w:t xml:space="preserve">Figure </w:t>
+                            </w:r>
+                            <w:r>
+                              <w:rPr/>
+                              <w:fldChar w:fldCharType="begin"/>
+                            </w:r>
+                            <w:r>
+                              <w:rPr/>
+                              <w:instrText xml:space="preserve"> SEQ Figure \* ARABIC </w:instrText>
+                            </w:r>
+                            <w:r>
+                              <w:rPr/>
+                              <w:fldChar w:fldCharType="separate"/>
+                            </w:r>
+                            <w:r>
+                              <w:rPr/>
+                              <w:t>15</w:t>
+                            </w:r>
+                            <w:r>
+                              <w:rPr/>
+                              <w:fldChar w:fldCharType="end"/>
+                            </w:r>
+                            <w:r>
+                              <w:rPr/>
+                              <w:t>: Record Count Chart</w:t>
+                            </w:r>
+                          </w:p>
+                        </w:txbxContent>
+                      </wps:txbx>
+                      <wps:bodyPr anchor="t" lIns="0" tIns="0" rIns="0" bIns="0">
+                        <a:noAutofit/>
+                      </wps:bodyPr>
+                    </wps:wsp>
+                  </a:graphicData>
+                </a:graphic>
+              </wp:inline>
+            </w:drawing>
+          </mc:Choice>
+          <mc:Fallback>
+            <w:pict>
+              <v:rect style="position:absolute;rotation:-0;width:396pt;height:228pt;mso-wrap-distance-left:0pt;mso-wrap-distance-right:0pt;mso-wrap-distance-top:0pt;mso-wrap-distance-bottom:0pt;margin-top:-228pt;mso-position-vertical:top;mso-position-vertical-relative:text;margin-left:0pt;mso-position-horizontal:center;mso-position-horizontal-relative:text">
+                <v:textbox inset="0in,0in,0in,0in">
+                  <w:txbxContent>
+                    <w:p>
+                      <w:pPr>
+                        <w:pStyle w:val="Figure"/>
+                        <w:spacing w:before="0" w:after="200"/>
+                        <w:jc w:val="center"/>
+                        <w:rPr/>
+                      </w:pPr>
+                      <w:r>
+                        <w:rPr/>
+                        <w:drawing>
+                          <wp:inline distT="0" distB="0" distL="0" distR="0">
+                            <wp:extent cx="5029200" cy="2755900"/>
+                            <wp:effectExtent l="0" t="0" r="0" b="0"/>
+                            <wp:docPr id="45" name="Picture 3"/>
+                            <wp:cNvGraphicFramePr>
+                              <a:graphicFrameLocks xmlns:a="http://schemas.openxmlformats.org/drawingml/2006/main" noChangeAspect="1"/>
+                            </wp:cNvGraphicFramePr>
+                            <a:graphic xmlns:a="http://schemas.openxmlformats.org/drawingml/2006/main">
+                              <a:graphicData uri="http://schemas.openxmlformats.org/drawingml/2006/picture">
+                                <pic:pic xmlns:pic="http://schemas.openxmlformats.org/drawingml/2006/picture">
+                                  <pic:nvPicPr>
+                                    <pic:cNvPr id="45" name="Picture 3"/>
+                                    <pic:cNvPicPr>
+                                      <a:picLocks noChangeAspect="1" noChangeArrowheads="1"/>
+                                    </pic:cNvPicPr>
+                                  </pic:nvPicPr>
+                                  <pic:blipFill>
+                                    <a:blip r:embed="rId31"/>
+                                    <a:stretch>
+                                      <a:fillRect/>
+                                    </a:stretch>
+                                  </pic:blipFill>
+                                  <pic:spPr bwMode="auto">
+                                    <a:xfrm>
+                                      <a:off x="0" y="0"/>
+                                      <a:ext cx="5029200" cy="2755900"/>
+                                    </a:xfrm>
+                                    <a:prstGeom prst="rect">
+                                      <a:avLst/>
+                                    </a:prstGeom>
+                                    <a:noFill/>
+                                  </pic:spPr>
+                                </pic:pic>
+                              </a:graphicData>
+                            </a:graphic>
+                          </wp:inline>
+                        </w:drawing>
+                        <w:t xml:space="preserve">Figure </w:t>
+                      </w:r>
+                      <w:r>
+                        <w:rPr/>
+                        <w:fldChar w:fldCharType="begin"/>
+                      </w:r>
+                      <w:r>
+                        <w:rPr/>
+                        <w:instrText xml:space="preserve"> SEQ Figure \* ARABIC </w:instrText>
+                      </w:r>
+                      <w:r>
+                        <w:rPr/>
+                        <w:fldChar w:fldCharType="separate"/>
+                      </w:r>
+                      <w:r>
+                        <w:rPr/>
+                        <w:t>15</w:t>
+                      </w:r>
+                      <w:r>
+                        <w:rPr/>
+                        <w:fldChar w:fldCharType="end"/>
+                      </w:r>
+                      <w:r>
+                        <w:rPr/>
+                        <w:t>: Record Count Chart</w:t>
+                      </w:r>
+                    </w:p>
+                  </w:txbxContent>
+                </v:textbox>
+                <w10:wrap type="square" side="largest"/>
+              </v:rect>
+            </w:pict>
+          </mc:Fallback>
+        </mc:AlternateContent>
       </w:r>
     </w:p>
     <w:p>
       <w:pPr>
-        <w:pStyle w:val="Normal"/>
-        <w:jc w:val="center"/>
-        <w:rPr>
-          <w:lang w:val="en-GB"/>
-        </w:rPr>
-      </w:pPr>
-      <w:r>
-        <w:rPr>
-          <w:i/>
-          <w:sz w:val="18"/>
-          <w:lang w:val="en-GB"/>
-        </w:rPr>
-        <w:t>Figure 3: Record count at each cleaning stage. 101,766 raw records reduce to 70,439 unique patient encounters after removing deceased patients and deduplicating to one encounter per patient.</w:t>
+        <w:pStyle w:val="Heading1"/>
+        <w:rPr>
+          <w:lang w:val="en-GB"/>
+        </w:rPr>
+      </w:pPr>
+      <w:r>
+        <w:rPr>
+          <w:lang w:val="en-GB"/>
+        </w:rPr>
+        <w:t xml:space="preserve">3. Exploratory Data Analysis </w:t>
+      </w:r>
+      <w:r>
+        <w:rPr>
+          <w:lang w:val="en-GB"/>
+        </w:rPr>
+        <w:t>(EDA)</w:t>
       </w:r>
     </w:p>
     <w:p>
       <w:pPr>
-        <w:pStyle w:val="Heading1"/>
-        <w:rPr>
-          <w:lang w:val="en-GB"/>
-        </w:rPr>
-      </w:pPr>
-      <w:r>
-        <w:rPr>
-          <w:lang w:val="en-GB"/>
-        </w:rPr>
-        <w:t>3. Exploratory Data Analysis</w:t>
+        <w:pStyle w:val="Normal"/>
+        <w:bidi w:val="0"/>
+        <w:rPr>
+          <w:lang w:val="en-GB"/>
+        </w:rPr>
+      </w:pPr>
+      <w:r>
+        <w:rPr>
+          <w:lang w:val="en-GB"/>
+        </w:rPr>
+        <w:t xml:space="preserve">EDA </w:t>
+      </w:r>
+      <w:r>
+        <w:rPr>
+          <w:lang w:val="en-GB"/>
+        </w:rPr>
+        <w:t>facilitates</w:t>
+      </w:r>
+      <w:r>
+        <w:rPr>
+          <w:lang w:val="en-GB"/>
+        </w:rPr>
+        <w:t xml:space="preserve"> the detection of naturally occuring patterns and anomalies in a dataset. It serves two purposes in this project.</w:t>
       </w:r>
     </w:p>
     <w:p>
@@ -4448,7 +5157,7 @@
         <w:rPr>
           <w:lang w:val="en-GB"/>
         </w:rPr>
-        <w:t>Exploratory Data Analysis (EDA) allows for the detection of naturally occuring patterns and anomalies in a dataset. It serves two purposes here in this project.</w:t>
+        <w:t>1. Identifying patterns that inform the clinical context</w:t>
       </w:r>
     </w:p>
     <w:p>
@@ -4463,49 +5172,60 @@
         <w:rPr>
           <w:lang w:val="en-GB"/>
         </w:rPr>
-        <w:t>1. Identifying patterns that inform the clinical context</w:t>
+        <w:t>2. Identify</w:t>
+      </w:r>
+      <w:r>
+        <w:rPr>
+          <w:u w:val="double"/>
+          <w:lang w:val="en-GB"/>
+        </w:rPr>
+        <w:t xml:space="preserve">ing </w:t>
+      </w:r>
+      <w:r>
+        <w:rPr>
+          <w:lang w:val="en-GB"/>
+        </w:rPr>
+        <w:t>features to guide feature engineering, further described in Section 4</w:t>
       </w:r>
     </w:p>
     <w:p>
       <w:pPr>
-        <w:pStyle w:val="Normal"/>
-        <w:bidi w:val="0"/>
-        <w:rPr>
-          <w:lang w:val="en-GB"/>
-        </w:rPr>
-      </w:pPr>
-      <w:r>
-        <w:rPr>
-          <w:lang w:val="en-GB"/>
-        </w:rPr>
-        <w:t>2. Identify</w:t>
-      </w:r>
-      <w:r>
-        <w:rPr>
-          <w:u w:val="double"/>
-          <w:lang w:val="en-GB"/>
-        </w:rPr>
-        <w:t xml:space="preserve"> </w:t>
-      </w:r>
-      <w:r>
-        <w:rPr>
-          <w:lang w:val="en-GB"/>
-        </w:rPr>
-        <w:t>features to guide feature engineering, further described in Section 4.</w:t>
+        <w:pStyle w:val="Heading2"/>
+        <w:rPr>
+          <w:lang w:val="en-GB"/>
+        </w:rPr>
+      </w:pPr>
+      <w:r>
+        <w:rPr>
+          <w:lang w:val="en-GB"/>
+        </w:rPr>
+        <w:t>3.1 Class Imbalance</w:t>
       </w:r>
     </w:p>
     <w:p>
       <w:pPr>
-        <w:pStyle w:val="Heading2"/>
-        <w:rPr>
-          <w:lang w:val="en-GB"/>
-        </w:rPr>
-      </w:pPr>
-      <w:r>
-        <w:rPr>
-          <w:lang w:val="en-GB"/>
-        </w:rPr>
-        <w:t>3.1 Class Imbalance</w:t>
+        <w:pStyle w:val="Normal"/>
+        <w:rPr>
+          <w:lang w:val="en-GB"/>
+        </w:rPr>
+      </w:pPr>
+      <w:r>
+        <w:rPr>
+          <w:lang w:val="en-GB"/>
+        </w:rPr>
+        <w:t xml:space="preserve">Only 8.9% of patient encounters result in early readmission. A </w:t>
+      </w:r>
+      <w:r>
+        <w:rPr>
+          <w:lang w:val="en-GB"/>
+        </w:rPr>
+        <w:t>model</w:t>
+      </w:r>
+      <w:r>
+        <w:rPr>
+          <w:lang w:val="en-GB"/>
+        </w:rPr>
+        <w:t xml:space="preserve"> that predicts 'not early' for every patient achieves 91.1% accuracy while identifying no at-risk patients. This means accuracy alone is a misleading metric. Two decisions followed::</w:t>
       </w:r>
     </w:p>
     <w:p>
@@ -4519,7 +5239,19 @@
         <w:rPr>
           <w:lang w:val="en-GB"/>
         </w:rPr>
-        <w:t>Only 8.9% of patient encounters result in early readmission. A classifier that simply predicts 'not early' for every patient achieves 91.1% accuracy while identifying no at-risk patients. This means accuracy alone is a misleading metric. Two decisions followed from this imbalance:</w:t>
+        <w:t xml:space="preserve">1. ROC-AUC was chosen as the primary evaluation metric. </w:t>
+      </w:r>
+      <w:r>
+        <w:rPr>
+          <w:lang w:val="en-GB"/>
+        </w:rPr>
+        <w:t>I</w:t>
+      </w:r>
+      <w:r>
+        <w:rPr>
+          <w:lang w:val="en-GB"/>
+        </w:rPr>
+        <w:t>t measures a model's ability to differentiate between patients that will be readmiitted, and those who wont, regardless of the threshold for “high-risk” patients.</w:t>
       </w:r>
     </w:p>
     <w:p>
@@ -4533,21 +5265,7 @@
         <w:rPr>
           <w:lang w:val="en-GB"/>
         </w:rPr>
-        <w:t>1. ROC-AUC was chosen as the primary evaluation metric because it measures a model's ability to differentiate between patients that will be readmiitted, and those who wont, regardless of the threshold for “high-risk” patients.</w:t>
-      </w:r>
-    </w:p>
-    <w:p>
-      <w:pPr>
-        <w:pStyle w:val="Normal"/>
-        <w:rPr>
-          <w:lang w:val="en-GB"/>
-        </w:rPr>
-      </w:pPr>
-      <w:r>
-        <w:rPr>
-          <w:lang w:val="en-GB"/>
-        </w:rPr>
-        <w:t>2. Balanced sample weights were applied during training to stop the model from optimising purely for the majority class.</w:t>
+        <w:t>2. Balanced sample weights were applied during training to stop the model from optimising for the majority class.</w:t>
       </w:r>
     </w:p>
     <w:p>
@@ -4587,7 +5305,35 @@
           <w:sz w:val="20"/>
           <w:lang w:val="en-GB"/>
         </w:rPr>
-        <w:t>A correlation heatmap highlights relationships between numerical features to identify which features are most strongly associated with early readmission risk. The creation of the heatmap is shown below:</w:t>
+        <w:t xml:space="preserve">A correlation heatmap highlights relationships between numerical features to identify features </w:t>
+      </w:r>
+      <w:r>
+        <w:rPr>
+          <w:rFonts w:ascii="system-ui;Ubuntu;Droid Sans;sans-serif" w:hAnsi="system-ui;Ubuntu;Droid Sans;sans-serif"/>
+          <w:b w:val="false"/>
+          <w:i w:val="false"/>
+          <w:caps w:val="false"/>
+          <w:smallCaps w:val="false"/>
+          <w:color w:val="000000"/>
+          <w:spacing w:val="0"/>
+          <w:sz w:val="20"/>
+          <w:lang w:val="en-GB"/>
+        </w:rPr>
+        <w:t>most</w:t>
+      </w:r>
+      <w:r>
+        <w:rPr>
+          <w:rFonts w:ascii="system-ui;Ubuntu;Droid Sans;sans-serif" w:hAnsi="system-ui;Ubuntu;Droid Sans;sans-serif"/>
+          <w:b w:val="false"/>
+          <w:i w:val="false"/>
+          <w:caps w:val="false"/>
+          <w:smallCaps w:val="false"/>
+          <w:color w:val="000000"/>
+          <w:spacing w:val="0"/>
+          <w:sz w:val="20"/>
+          <w:lang w:val="en-GB"/>
+        </w:rPr>
+        <w:t xml:space="preserve"> strongly associated with early readmission risk. The creation of the heatmap is shown below:</w:t>
       </w:r>
     </w:p>
     <w:p>
@@ -4634,7 +5380,7 @@
                 <wp:extent cx="5972810" cy="4267835"/>
                 <wp:effectExtent l="0" t="0" r="0" b="0"/>
                 <wp:wrapSquare wrapText="largest"/>
-                <wp:docPr id="44" name="Frame15"/>
+                <wp:docPr id="46" name="Frame15"/>
                 <a:graphic xmlns:a="http://schemas.openxmlformats.org/drawingml/2006/main">
                   <a:graphicData uri="http://schemas.microsoft.com/office/word/2010/wordprocessingShape">
                     <wps:wsp>
@@ -4677,7 +5423,7 @@
                                 <wp:inline distT="0" distB="0" distL="0" distR="0">
                                   <wp:extent cx="5972810" cy="4128135"/>
                                   <wp:effectExtent l="0" t="0" r="0" b="0"/>
-                                  <wp:docPr id="45" name="Image13"/>
+                                  <wp:docPr id="47" name="Image13"/>
                                   <wp:cNvGraphicFramePr>
                                     <a:graphicFrameLocks xmlns:a="http://schemas.openxmlformats.org/drawingml/2006/main" noChangeAspect="1"/>
                                   </wp:cNvGraphicFramePr>
@@ -4685,13 +5431,13 @@
                                     <a:graphicData uri="http://schemas.openxmlformats.org/drawingml/2006/picture">
                                       <pic:pic xmlns:pic="http://schemas.openxmlformats.org/drawingml/2006/picture">
                                         <pic:nvPicPr>
-                                          <pic:cNvPr id="45" name="Image13"/>
+                                          <pic:cNvPr id="47" name="Image13"/>
                                           <pic:cNvPicPr>
                                             <a:picLocks noChangeAspect="1" noChangeArrowheads="1"/>
                                           </pic:cNvPicPr>
                                         </pic:nvPicPr>
                                         <pic:blipFill>
-                                          <a:blip r:embed="rId31"/>
+                                          <a:blip r:embed="rId32"/>
                                           <a:stretch>
                                             <a:fillRect/>
                                           </a:stretch>
@@ -4700,263 +5446,6 @@
                                           <a:xfrm>
                                             <a:off x="0" y="0"/>
                                             <a:ext cx="5972810" cy="4128135"/>
-                                          </a:xfrm>
-                                          <a:prstGeom prst="rect">
-                                            <a:avLst/>
-                                          </a:prstGeom>
-                                          <a:noFill/>
-                                        </pic:spPr>
-                                      </pic:pic>
-                                    </a:graphicData>
-                                  </a:graphic>
-                                </wp:inline>
-                              </w:drawing>
-                            </w:r>
-                            <w:r>
-                              <w:rPr>
-                                <w:lang w:val="en-GB"/>
-                              </w:rPr>
-                              <w:t xml:space="preserve">Figure </w:t>
-                            </w:r>
-                            <w:r>
-                              <w:rPr>
-                                <w:lang w:val="en-GB"/>
-                              </w:rPr>
-                              <w:fldChar w:fldCharType="begin"/>
-                            </w:r>
-                            <w:r>
-                              <w:rPr>
-                                <w:lang w:val="en-GB"/>
-                              </w:rPr>
-                              <w:instrText xml:space="preserve"> SEQ Figure \* ARABIC </w:instrText>
-                            </w:r>
-                            <w:r>
-                              <w:rPr>
-                                <w:lang w:val="en-GB"/>
-                              </w:rPr>
-                              <w:fldChar w:fldCharType="separate"/>
-                            </w:r>
-                            <w:r>
-                              <w:rPr>
-                                <w:lang w:val="en-GB"/>
-                              </w:rPr>
-                              <w:t>15</w:t>
-                            </w:r>
-                            <w:r>
-                              <w:rPr>
-                                <w:lang w:val="en-GB"/>
-                              </w:rPr>
-                              <w:fldChar w:fldCharType="end"/>
-                            </w:r>
-                            <w:r>
-                              <w:rPr>
-                                <w:lang w:val="en-GB"/>
-                              </w:rPr>
-                              <w:t>: Creation of Correlation Heatmap</w:t>
-                            </w:r>
-                          </w:p>
-                        </w:txbxContent>
-                      </wps:txbx>
-                      <wps:bodyPr lIns="0" tIns="0" rIns="0" bIns="0" anchor="t">
-                        <a:noAutofit/>
-                      </wps:bodyPr>
-                    </wps:wsp>
-                  </a:graphicData>
-                </a:graphic>
-              </wp:anchor>
-            </w:drawing>
-          </mc:Choice>
-          <mc:Fallback>
-            <w:pict>
-              <v:rect id="shape_0" fillcolor="white" stroked="f" o:allowincell="f" style="position:absolute;margin-left:0pt;margin-top:0.05pt;width:470.25pt;height:336pt;mso-wrap-style:square;v-text-anchor:top;mso-position-horizontal:center">
-                <v:fill o:detectmouseclick="t" type="solid" color2="black"/>
-                <v:stroke color="#3465a4" joinstyle="round" endcap="flat"/>
-                <v:textbox>
-                  <w:txbxContent>
-                    <w:p>
-                      <w:pPr>
-                        <w:pStyle w:val="Figure"/>
-                        <w:spacing w:before="0" w:after="200"/>
-                        <w:jc w:val="center"/>
-                        <w:rPr>
-                          <w:lang w:val="en-GB"/>
-                        </w:rPr>
-                      </w:pPr>
-                      <w:r>
-                        <w:rPr/>
-                        <w:drawing>
-                          <wp:inline distT="0" distB="0" distL="0" distR="0">
-                            <wp:extent cx="5972810" cy="4128135"/>
-                            <wp:effectExtent l="0" t="0" r="0" b="0"/>
-                            <wp:docPr id="46" name="Image13"/>
-                            <wp:cNvGraphicFramePr>
-                              <a:graphicFrameLocks xmlns:a="http://schemas.openxmlformats.org/drawingml/2006/main" noChangeAspect="1"/>
-                            </wp:cNvGraphicFramePr>
-                            <a:graphic xmlns:a="http://schemas.openxmlformats.org/drawingml/2006/main">
-                              <a:graphicData uri="http://schemas.openxmlformats.org/drawingml/2006/picture">
-                                <pic:pic xmlns:pic="http://schemas.openxmlformats.org/drawingml/2006/picture">
-                                  <pic:nvPicPr>
-                                    <pic:cNvPr id="46" name="Image13"/>
-                                    <pic:cNvPicPr>
-                                      <a:picLocks noChangeAspect="1" noChangeArrowheads="1"/>
-                                    </pic:cNvPicPr>
-                                  </pic:nvPicPr>
-                                  <pic:blipFill>
-                                    <a:blip r:embed="rId32"/>
-                                    <a:stretch>
-                                      <a:fillRect/>
-                                    </a:stretch>
-                                  </pic:blipFill>
-                                  <pic:spPr bwMode="auto">
-                                    <a:xfrm>
-                                      <a:off x="0" y="0"/>
-                                      <a:ext cx="5972810" cy="4128135"/>
-                                    </a:xfrm>
-                                    <a:prstGeom prst="rect">
-                                      <a:avLst/>
-                                    </a:prstGeom>
-                                    <a:noFill/>
-                                  </pic:spPr>
-                                </pic:pic>
-                              </a:graphicData>
-                            </a:graphic>
-                          </wp:inline>
-                        </w:drawing>
-                      </w:r>
-                      <w:r>
-                        <w:rPr>
-                          <w:lang w:val="en-GB"/>
-                        </w:rPr>
-                        <w:t xml:space="preserve">Figure </w:t>
-                      </w:r>
-                      <w:r>
-                        <w:rPr>
-                          <w:lang w:val="en-GB"/>
-                        </w:rPr>
-                        <w:fldChar w:fldCharType="begin"/>
-                      </w:r>
-                      <w:r>
-                        <w:rPr>
-                          <w:lang w:val="en-GB"/>
-                        </w:rPr>
-                        <w:instrText xml:space="preserve"> SEQ Figure \* ARABIC </w:instrText>
-                      </w:r>
-                      <w:r>
-                        <w:rPr>
-                          <w:lang w:val="en-GB"/>
-                        </w:rPr>
-                        <w:fldChar w:fldCharType="separate"/>
-                      </w:r>
-                      <w:r>
-                        <w:rPr>
-                          <w:lang w:val="en-GB"/>
-                        </w:rPr>
-                        <w:t>15</w:t>
-                      </w:r>
-                      <w:r>
-                        <w:rPr>
-                          <w:lang w:val="en-GB"/>
-                        </w:rPr>
-                        <w:fldChar w:fldCharType="end"/>
-                      </w:r>
-                      <w:r>
-                        <w:rPr>
-                          <w:lang w:val="en-GB"/>
-                        </w:rPr>
-                        <w:t>: Creation of Correlation Heatmap</w:t>
-                      </w:r>
-                    </w:p>
-                  </w:txbxContent>
-                </v:textbox>
-                <w10:wrap type="square" side="largest"/>
-              </v:rect>
-            </w:pict>
-          </mc:Fallback>
-        </mc:AlternateContent>
-      </w:r>
-    </w:p>
-    <w:p>
-      <w:pPr>
-        <w:pStyle w:val="Normal"/>
-        <w:jc w:val="center"/>
-        <w:rPr>
-          <w:lang w:val="en-GB"/>
-        </w:rPr>
-      </w:pPr>
-      <w:r>
-        <w:rPr/>
-        <mc:AlternateContent>
-          <mc:Choice Requires="wps">
-            <w:drawing>
-              <wp:inline distT="0" distB="0" distL="0" distR="0">
-                <wp:extent cx="5029200" cy="4335780"/>
-                <wp:effectExtent l="0" t="0" r="0" b="0"/>
-                <wp:docPr id="47" name="Frame16"/>
-                <a:graphic xmlns:a="http://schemas.openxmlformats.org/drawingml/2006/main">
-                  <a:graphicData uri="http://schemas.microsoft.com/office/word/2010/wordprocessingShape">
-                    <wps:wsp>
-                      <wps:cNvSpPr/>
-                      <wps:spPr>
-                        <a:xfrm>
-                          <a:off x="0" y="0"/>
-                          <a:ext cx="5029200" cy="4335840"/>
-                        </a:xfrm>
-                        <a:prstGeom prst="rect">
-                          <a:avLst/>
-                        </a:prstGeom>
-                        <a:solidFill>
-                          <a:srgbClr val="FFFFFF"/>
-                        </a:solidFill>
-                        <a:ln w="0">
-                          <a:noFill/>
-                        </a:ln>
-                      </wps:spPr>
-                      <wps:style>
-                        <a:lnRef idx="0"/>
-                        <a:fillRef idx="0"/>
-                        <a:effectRef idx="0"/>
-                        <a:fontRef idx="minor"/>
-                      </wps:style>
-                      <wps:txbx>
-                        <w:txbxContent>
-                          <w:p>
-                            <w:pPr>
-                              <w:pStyle w:val="Figure"/>
-                              <w:spacing w:before="0" w:after="200"/>
-                              <w:jc w:val="center"/>
-                              <w:rPr>
-                                <w:lang w:val="en-GB"/>
-                              </w:rPr>
-                            </w:pPr>
-                            <w:r>
-                              <w:rPr/>
-                              <w:drawing>
-                                <wp:inline distT="0" distB="0" distL="0" distR="0">
-                                  <wp:extent cx="5029200" cy="4196080"/>
-                                  <wp:effectExtent l="0" t="0" r="0" b="0"/>
-                                  <wp:docPr id="48" name="Picture 4"/>
-                                  <wp:cNvGraphicFramePr>
-                                    <a:graphicFrameLocks xmlns:a="http://schemas.openxmlformats.org/drawingml/2006/main" noChangeAspect="1"/>
-                                  </wp:cNvGraphicFramePr>
-                                  <a:graphic xmlns:a="http://schemas.openxmlformats.org/drawingml/2006/main">
-                                    <a:graphicData uri="http://schemas.openxmlformats.org/drawingml/2006/picture">
-                                      <pic:pic xmlns:pic="http://schemas.openxmlformats.org/drawingml/2006/picture">
-                                        <pic:nvPicPr>
-                                          <pic:cNvPr id="48" name="Picture 4"/>
-                                          <pic:cNvPicPr>
-                                            <a:picLocks noChangeAspect="1" noChangeArrowheads="1"/>
-                                          </pic:cNvPicPr>
-                                        </pic:nvPicPr>
-                                        <pic:blipFill>
-                                          <a:blip r:embed="rId33"/>
-                                          <a:stretch>
-                                            <a:fillRect/>
-                                          </a:stretch>
-                                        </pic:blipFill>
-                                        <pic:spPr bwMode="auto">
-                                          <a:xfrm>
-                                            <a:off x="0" y="0"/>
-                                            <a:ext cx="5029200" cy="4196080"/>
                                           </a:xfrm>
                                           <a:prstGeom prst="rect">
                                             <a:avLst/>
@@ -5009,7 +5498,7 @@
                               <w:rPr>
                                 <w:lang w:val="en-GB"/>
                               </w:rPr>
-                              <w:t>: Produced Correlation Heatmap</w:t>
+                              <w:t>: Creation of Correlation Heatmap</w:t>
                             </w:r>
                           </w:p>
                         </w:txbxContent>
@@ -5020,12 +5509,12 @@
                     </wps:wsp>
                   </a:graphicData>
                 </a:graphic>
-              </wp:inline>
+              </wp:anchor>
             </w:drawing>
           </mc:Choice>
           <mc:Fallback>
             <w:pict>
-              <v:rect id="shape_0" fillcolor="white" stroked="f" o:allowincell="f" style="position:absolute;margin-left:0pt;margin-top:-341.45pt;width:395.95pt;height:341.35pt;mso-wrap-style:square;v-text-anchor:top;mso-position-vertical:top">
+              <v:rect id="shape_0" fillcolor="white" stroked="f" o:allowincell="f" style="position:absolute;margin-left:0pt;margin-top:0.05pt;width:470.25pt;height:336pt;mso-wrap-style:square;v-text-anchor:top;mso-position-horizontal:center">
                 <v:fill o:detectmouseclick="t" type="solid" color2="black"/>
                 <v:stroke color="#3465a4" joinstyle="round" endcap="flat"/>
                 <v:textbox>
@@ -5043,9 +5532,9 @@
                         <w:rPr/>
                         <w:drawing>
                           <wp:inline distT="0" distB="0" distL="0" distR="0">
-                            <wp:extent cx="5029200" cy="4196080"/>
+                            <wp:extent cx="5972810" cy="4128135"/>
                             <wp:effectExtent l="0" t="0" r="0" b="0"/>
-                            <wp:docPr id="49" name="Picture 4"/>
+                            <wp:docPr id="48" name="Image13"/>
                             <wp:cNvGraphicFramePr>
                               <a:graphicFrameLocks xmlns:a="http://schemas.openxmlformats.org/drawingml/2006/main" noChangeAspect="1"/>
                             </wp:cNvGraphicFramePr>
@@ -5053,13 +5542,13 @@
                               <a:graphicData uri="http://schemas.openxmlformats.org/drawingml/2006/picture">
                                 <pic:pic xmlns:pic="http://schemas.openxmlformats.org/drawingml/2006/picture">
                                   <pic:nvPicPr>
-                                    <pic:cNvPr id="49" name="Picture 4"/>
+                                    <pic:cNvPr id="48" name="Image13"/>
                                     <pic:cNvPicPr>
                                       <a:picLocks noChangeAspect="1" noChangeArrowheads="1"/>
                                     </pic:cNvPicPr>
                                   </pic:nvPicPr>
                                   <pic:blipFill>
-                                    <a:blip r:embed="rId34"/>
+                                    <a:blip r:embed="rId33"/>
                                     <a:stretch>
                                       <a:fillRect/>
                                     </a:stretch>
@@ -5067,7 +5556,7 @@
                                   <pic:spPr bwMode="auto">
                                     <a:xfrm>
                                       <a:off x="0" y="0"/>
-                                      <a:ext cx="5029200" cy="4196080"/>
+                                      <a:ext cx="5972810" cy="4128135"/>
                                     </a:xfrm>
                                     <a:prstGeom prst="rect">
                                       <a:avLst/>
@@ -5120,68 +5609,16 @@
                         <w:rPr>
                           <w:lang w:val="en-GB"/>
                         </w:rPr>
-                        <w:t>: Produced Correlation Heatmap</w:t>
+                        <w:t>: Creation of Correlation Heatmap</w:t>
                       </w:r>
                     </w:p>
                   </w:txbxContent>
                 </v:textbox>
-                <w10:wrap type="square"/>
+                <w10:wrap type="square" side="largest"/>
               </v:rect>
             </w:pict>
           </mc:Fallback>
         </mc:AlternateContent>
-      </w:r>
-    </w:p>
-    <w:p>
-      <w:pPr>
-        <w:pStyle w:val="Normal"/>
-        <w:rPr>
-          <w:lang w:val="en-GB"/>
-        </w:rPr>
-      </w:pPr>
-      <w:r>
-        <w:rPr>
-          <w:lang w:val="en-GB"/>
-        </w:rPr>
-        <w:t>Prior inpatient admissions (number_inpatient) show the strongest individual correlation with early readmission. This is consistent with Jencks et al.[4], who found 19.6% of Medicare patients were rehospitalised within 30 days, with over half receiving no documented physician follow-up after discharge. Per-day averages were used so that longer hospital stays would not artificially inflate the number of procedures recorded for a patient.</w:t>
-      </w:r>
-    </w:p>
-    <w:p>
-      <w:pPr>
-        <w:pStyle w:val="Heading2"/>
-        <w:rPr>
-          <w:lang w:val="en-GB"/>
-        </w:rPr>
-      </w:pPr>
-      <w:r>
-        <w:rPr>
-          <w:lang w:val="en-GB"/>
-        </w:rPr>
-        <w:t>3.3 Readmission by Clinical Subgroup</w:t>
-      </w:r>
-    </w:p>
-    <w:p>
-      <w:pPr>
-        <w:pStyle w:val="Normal"/>
-        <w:widowControl/>
-        <w:ind w:hanging="0" w:start="0" w:end="0"/>
-        <w:rPr>
-          <w:lang w:val="en-GB"/>
-        </w:rPr>
-      </w:pPr>
-      <w:r>
-        <w:rPr>
-          <w:rFonts w:ascii="system-ui;Ubuntu;Droid Sans;sans-serif" w:hAnsi="system-ui;Ubuntu;Droid Sans;sans-serif"/>
-          <w:b w:val="false"/>
-          <w:i w:val="false"/>
-          <w:caps w:val="false"/>
-          <w:smallCaps w:val="false"/>
-          <w:color w:val="000000"/>
-          <w:spacing w:val="0"/>
-          <w:sz w:val="20"/>
-          <w:lang w:val="en-GB"/>
-        </w:rPr>
-        <w:t>The project analyses early readmission rates across age groups to identify whether particular age groups are at risk of readmission within 30 days. Figure 17 shows that risk is highest in the 60-80 age range. This is expected, as diabetes management is typically highest at this range.</w:t>
       </w:r>
     </w:p>
     <w:p>
@@ -5198,9 +5635,9 @@
           <mc:Choice Requires="wps">
             <w:drawing>
               <wp:inline distT="0" distB="0" distL="0" distR="0">
-                <wp:extent cx="5029200" cy="2620645"/>
+                <wp:extent cx="5029200" cy="4335780"/>
                 <wp:effectExtent l="0" t="0" r="0" b="0"/>
-                <wp:docPr id="50" name="Frame17"/>
+                <wp:docPr id="49" name="Frame16"/>
                 <a:graphic xmlns:a="http://schemas.openxmlformats.org/drawingml/2006/main">
                   <a:graphicData uri="http://schemas.microsoft.com/office/word/2010/wordprocessingShape">
                     <wps:wsp>
@@ -5208,7 +5645,7 @@
                       <wps:spPr>
                         <a:xfrm>
                           <a:off x="0" y="0"/>
-                          <a:ext cx="5029200" cy="2620800"/>
+                          <a:ext cx="5029200" cy="4335840"/>
                         </a:xfrm>
                         <a:prstGeom prst="rect">
                           <a:avLst/>
@@ -5241,9 +5678,9 @@
                               <w:rPr/>
                               <w:drawing>
                                 <wp:inline distT="0" distB="0" distL="0" distR="0">
-                                  <wp:extent cx="5029200" cy="2480945"/>
+                                  <wp:extent cx="5029200" cy="4196080"/>
                                   <wp:effectExtent l="0" t="0" r="0" b="0"/>
-                                  <wp:docPr id="51" name="Picture 5"/>
+                                  <wp:docPr id="50" name="Picture 4"/>
                                   <wp:cNvGraphicFramePr>
                                     <a:graphicFrameLocks xmlns:a="http://schemas.openxmlformats.org/drawingml/2006/main" noChangeAspect="1"/>
                                   </wp:cNvGraphicFramePr>
@@ -5251,13 +5688,13 @@
                                     <a:graphicData uri="http://schemas.openxmlformats.org/drawingml/2006/picture">
                                       <pic:pic xmlns:pic="http://schemas.openxmlformats.org/drawingml/2006/picture">
                                         <pic:nvPicPr>
-                                          <pic:cNvPr id="51" name="Picture 5"/>
+                                          <pic:cNvPr id="50" name="Picture 4"/>
                                           <pic:cNvPicPr>
                                             <a:picLocks noChangeAspect="1" noChangeArrowheads="1"/>
                                           </pic:cNvPicPr>
                                         </pic:nvPicPr>
                                         <pic:blipFill>
-                                          <a:blip r:embed="rId35"/>
+                                          <a:blip r:embed="rId34"/>
                                           <a:stretch>
                                             <a:fillRect/>
                                           </a:stretch>
@@ -5265,7 +5702,7 @@
                                         <pic:spPr bwMode="auto">
                                           <a:xfrm>
                                             <a:off x="0" y="0"/>
-                                            <a:ext cx="5029200" cy="2480945"/>
+                                            <a:ext cx="5029200" cy="4196080"/>
                                           </a:xfrm>
                                           <a:prstGeom prst="rect">
                                             <a:avLst/>
@@ -5318,7 +5755,7 @@
                               <w:rPr>
                                 <w:lang w:val="en-GB"/>
                               </w:rPr>
-                              <w:t>: Early Readmission Rate by Age Group</w:t>
+                              <w:t>: Produced Correlation Heatmap</w:t>
                             </w:r>
                           </w:p>
                         </w:txbxContent>
@@ -5334,7 +5771,7 @@
           </mc:Choice>
           <mc:Fallback>
             <w:pict>
-              <v:rect id="shape_0" fillcolor="white" stroked="f" o:allowincell="f" style="position:absolute;margin-left:0pt;margin-top:-206.4pt;width:395.95pt;height:206.3pt;mso-wrap-style:square;v-text-anchor:top;mso-position-vertical:top">
+              <v:rect id="shape_0" fillcolor="white" stroked="f" o:allowincell="f" style="position:absolute;margin-left:0pt;margin-top:-341.45pt;width:395.95pt;height:341.35pt;mso-wrap-style:square;v-text-anchor:top;mso-position-vertical:top">
                 <v:fill o:detectmouseclick="t" type="solid" color2="black"/>
                 <v:stroke color="#3465a4" joinstyle="round" endcap="flat"/>
                 <v:textbox>
@@ -5352,9 +5789,9 @@
                         <w:rPr/>
                         <w:drawing>
                           <wp:inline distT="0" distB="0" distL="0" distR="0">
-                            <wp:extent cx="5029200" cy="2480945"/>
+                            <wp:extent cx="5029200" cy="4196080"/>
                             <wp:effectExtent l="0" t="0" r="0" b="0"/>
-                            <wp:docPr id="52" name="Picture 5"/>
+                            <wp:docPr id="51" name="Picture 4"/>
                             <wp:cNvGraphicFramePr>
                               <a:graphicFrameLocks xmlns:a="http://schemas.openxmlformats.org/drawingml/2006/main" noChangeAspect="1"/>
                             </wp:cNvGraphicFramePr>
@@ -5362,13 +5799,13 @@
                               <a:graphicData uri="http://schemas.openxmlformats.org/drawingml/2006/picture">
                                 <pic:pic xmlns:pic="http://schemas.openxmlformats.org/drawingml/2006/picture">
                                   <pic:nvPicPr>
-                                    <pic:cNvPr id="52" name="Picture 5"/>
+                                    <pic:cNvPr id="51" name="Picture 4"/>
                                     <pic:cNvPicPr>
                                       <a:picLocks noChangeAspect="1" noChangeArrowheads="1"/>
                                     </pic:cNvPicPr>
                                   </pic:nvPicPr>
                                   <pic:blipFill>
-                                    <a:blip r:embed="rId36"/>
+                                    <a:blip r:embed="rId35"/>
                                     <a:stretch>
                                       <a:fillRect/>
                                     </a:stretch>
@@ -5376,7 +5813,7 @@
                                   <pic:spPr bwMode="auto">
                                     <a:xfrm>
                                       <a:off x="0" y="0"/>
-                                      <a:ext cx="5029200" cy="2480945"/>
+                                      <a:ext cx="5029200" cy="4196080"/>
                                     </a:xfrm>
                                     <a:prstGeom prst="rect">
                                       <a:avLst/>
@@ -5429,7 +5866,7 @@
                         <w:rPr>
                           <w:lang w:val="en-GB"/>
                         </w:rPr>
-                        <w:t>: Early Readmission Rate by Age Group</w:t>
+                        <w:t>: Produced Correlation Heatmap</w:t>
                       </w:r>
                     </w:p>
                   </w:txbxContent>
@@ -5444,16 +5881,201 @@
     <w:p>
       <w:pPr>
         <w:pStyle w:val="Normal"/>
-        <w:jc w:val="start"/>
-        <w:rPr>
-          <w:lang w:val="en-GB"/>
-        </w:rPr>
-      </w:pPr>
-      <w:r>
-        <w:rPr>
-          <w:lang w:val="en-GB"/>
-        </w:rPr>
-        <w:t>The early admission rate is also compared across diagnosis categories, defined during data cleaning (see Section 2.4). Figure 18 shows that Injury, Circulatory and Diabetes issues lead to highest rates.</w:t>
+        <w:rPr>
+          <w:lang w:val="en-GB"/>
+        </w:rPr>
+      </w:pPr>
+      <w:r>
+        <w:rPr>
+          <w:lang w:val="en-GB"/>
+        </w:rPr>
+        <w:t>Prior admissions (number_inpatient) show</w:t>
+      </w:r>
+      <w:r>
+        <w:rPr>
+          <w:lang w:val="en-GB"/>
+        </w:rPr>
+        <w:t>s</w:t>
+      </w:r>
+      <w:r>
+        <w:rPr>
+          <w:lang w:val="en-GB"/>
+        </w:rPr>
+        <w:t xml:space="preserve"> the strongest correlation with early readmission. This is consistent with Jencks et al.[4], who found 19.6% of Medicare patients were rehospitalised within 30 days. Per-day averages were used so longer hospital stays </w:t>
+      </w:r>
+      <w:r>
+        <w:rPr>
+          <w:lang w:val="en-GB"/>
+        </w:rPr>
+        <w:t>do</w:t>
+      </w:r>
+      <w:r>
+        <w:rPr>
+          <w:lang w:val="en-GB"/>
+        </w:rPr>
+        <w:t xml:space="preserve"> not artificially inflate the number of procedures recorded </w:t>
+      </w:r>
+      <w:r>
+        <w:rPr>
+          <w:lang w:val="en-GB"/>
+        </w:rPr>
+        <w:t xml:space="preserve">per </w:t>
+      </w:r>
+      <w:r>
+        <w:rPr>
+          <w:lang w:val="en-GB"/>
+        </w:rPr>
+        <w:t>patient.</w:t>
+      </w:r>
+    </w:p>
+    <w:p>
+      <w:pPr>
+        <w:pStyle w:val="Heading2"/>
+        <w:rPr>
+          <w:lang w:val="en-GB"/>
+        </w:rPr>
+      </w:pPr>
+      <w:r>
+        <w:rPr>
+          <w:lang w:val="en-GB"/>
+        </w:rPr>
+        <w:t>3.3 Readmission by Clinical Subgroup</w:t>
+      </w:r>
+    </w:p>
+    <w:p>
+      <w:pPr>
+        <w:pStyle w:val="Normal"/>
+        <w:widowControl/>
+        <w:ind w:hanging="0" w:start="0" w:end="0"/>
+        <w:rPr>
+          <w:lang w:val="en-GB"/>
+        </w:rPr>
+      </w:pPr>
+      <w:r>
+        <w:rPr>
+          <w:rFonts w:ascii="system-ui;Ubuntu;Droid Sans;sans-serif" w:hAnsi="system-ui;Ubuntu;Droid Sans;sans-serif"/>
+          <w:b w:val="false"/>
+          <w:i w:val="false"/>
+          <w:caps w:val="false"/>
+          <w:smallCaps w:val="false"/>
+          <w:color w:val="000000"/>
+          <w:spacing w:val="0"/>
+          <w:sz w:val="20"/>
+          <w:lang w:val="en-GB"/>
+        </w:rPr>
+        <w:t xml:space="preserve">The project analyses early readmission rates across age groups to identify whether particular age groups are at </w:t>
+      </w:r>
+      <w:r>
+        <w:rPr>
+          <w:rFonts w:ascii="system-ui;Ubuntu;Droid Sans;sans-serif" w:hAnsi="system-ui;Ubuntu;Droid Sans;sans-serif"/>
+          <w:b w:val="false"/>
+          <w:i w:val="false"/>
+          <w:caps w:val="false"/>
+          <w:smallCaps w:val="false"/>
+          <w:color w:val="000000"/>
+          <w:spacing w:val="0"/>
+          <w:sz w:val="20"/>
+          <w:lang w:val="en-GB"/>
+        </w:rPr>
+        <w:t xml:space="preserve">higher </w:t>
+      </w:r>
+      <w:r>
+        <w:rPr>
+          <w:rFonts w:ascii="system-ui;Ubuntu;Droid Sans;sans-serif" w:hAnsi="system-ui;Ubuntu;Droid Sans;sans-serif"/>
+          <w:b w:val="false"/>
+          <w:i w:val="false"/>
+          <w:caps w:val="false"/>
+          <w:smallCaps w:val="false"/>
+          <w:color w:val="000000"/>
+          <w:spacing w:val="0"/>
+          <w:sz w:val="20"/>
+          <w:lang w:val="en-GB"/>
+        </w:rPr>
+        <w:t>risk of readmission. Figure 1</w:t>
+      </w:r>
+      <w:r>
+        <w:rPr>
+          <w:rFonts w:ascii="system-ui;Ubuntu;Droid Sans;sans-serif" w:hAnsi="system-ui;Ubuntu;Droid Sans;sans-serif"/>
+          <w:b w:val="false"/>
+          <w:i w:val="false"/>
+          <w:caps w:val="false"/>
+          <w:smallCaps w:val="false"/>
+          <w:color w:val="000000"/>
+          <w:spacing w:val="0"/>
+          <w:sz w:val="20"/>
+          <w:lang w:val="en-GB"/>
+        </w:rPr>
+        <w:t>8</w:t>
+      </w:r>
+      <w:r>
+        <w:rPr>
+          <w:rFonts w:ascii="system-ui;Ubuntu;Droid Sans;sans-serif" w:hAnsi="system-ui;Ubuntu;Droid Sans;sans-serif"/>
+          <w:b w:val="false"/>
+          <w:i w:val="false"/>
+          <w:caps w:val="false"/>
+          <w:smallCaps w:val="false"/>
+          <w:color w:val="000000"/>
+          <w:spacing w:val="0"/>
+          <w:sz w:val="20"/>
+          <w:lang w:val="en-GB"/>
+        </w:rPr>
+        <w:t xml:space="preserve"> shows that risk is highest in the 60-80 age range. This is expected, as diabetes management is typically highest at </w:t>
+      </w:r>
+      <w:r>
+        <w:rPr>
+          <w:rFonts w:ascii="system-ui;Ubuntu;Droid Sans;sans-serif" w:hAnsi="system-ui;Ubuntu;Droid Sans;sans-serif"/>
+          <w:b w:val="false"/>
+          <w:i w:val="false"/>
+          <w:caps w:val="false"/>
+          <w:smallCaps w:val="false"/>
+          <w:color w:val="000000"/>
+          <w:spacing w:val="0"/>
+          <w:sz w:val="20"/>
+          <w:lang w:val="en-GB"/>
+        </w:rPr>
+        <w:t>these</w:t>
+      </w:r>
+      <w:r>
+        <w:rPr>
+          <w:rFonts w:ascii="system-ui;Ubuntu;Droid Sans;sans-serif" w:hAnsi="system-ui;Ubuntu;Droid Sans;sans-serif"/>
+          <w:b w:val="false"/>
+          <w:i w:val="false"/>
+          <w:caps w:val="false"/>
+          <w:smallCaps w:val="false"/>
+          <w:color w:val="000000"/>
+          <w:spacing w:val="0"/>
+          <w:sz w:val="20"/>
+          <w:lang w:val="en-GB"/>
+        </w:rPr>
+        <w:t xml:space="preserve"> </w:t>
+      </w:r>
+      <w:r>
+        <w:rPr>
+          <w:rFonts w:ascii="system-ui;Ubuntu;Droid Sans;sans-serif" w:hAnsi="system-ui;Ubuntu;Droid Sans;sans-serif"/>
+          <w:b w:val="false"/>
+          <w:i w:val="false"/>
+          <w:caps w:val="false"/>
+          <w:smallCaps w:val="false"/>
+          <w:color w:val="000000"/>
+          <w:spacing w:val="0"/>
+          <w:sz w:val="20"/>
+          <w:lang w:val="en-GB"/>
+        </w:rPr>
+        <w:t>ages</w:t>
+      </w:r>
+      <w:r>
+        <w:rPr>
+          <w:rFonts w:ascii="system-ui;Ubuntu;Droid Sans;sans-serif" w:hAnsi="system-ui;Ubuntu;Droid Sans;sans-serif"/>
+          <w:b w:val="false"/>
+          <w:i w:val="false"/>
+          <w:caps w:val="false"/>
+          <w:smallCaps w:val="false"/>
+          <w:color w:val="000000"/>
+          <w:spacing w:val="0"/>
+          <w:sz w:val="20"/>
+          <w:lang w:val="en-GB"/>
+        </w:rPr>
+        <w:t>.</w:t>
       </w:r>
     </w:p>
     <w:p>
@@ -5470,9 +6092,9 @@
           <mc:Choice Requires="wps">
             <w:drawing>
               <wp:inline distT="0" distB="0" distL="0" distR="0">
-                <wp:extent cx="5029200" cy="3472180"/>
+                <wp:extent cx="5029200" cy="2620645"/>
                 <wp:effectExtent l="0" t="0" r="0" b="0"/>
-                <wp:docPr id="53" name="Frame18"/>
+                <wp:docPr id="52" name="Frame17"/>
                 <a:graphic xmlns:a="http://schemas.openxmlformats.org/drawingml/2006/main">
                   <a:graphicData uri="http://schemas.microsoft.com/office/word/2010/wordprocessingShape">
                     <wps:wsp>
@@ -5480,7 +6102,7 @@
                       <wps:spPr>
                         <a:xfrm>
                           <a:off x="0" y="0"/>
-                          <a:ext cx="5029200" cy="3472200"/>
+                          <a:ext cx="5029200" cy="2620800"/>
                         </a:xfrm>
                         <a:prstGeom prst="rect">
                           <a:avLst/>
@@ -5513,9 +6135,9 @@
                               <w:rPr/>
                               <w:drawing>
                                 <wp:inline distT="0" distB="0" distL="0" distR="0">
-                                  <wp:extent cx="5029200" cy="3332480"/>
+                                  <wp:extent cx="5029200" cy="2480945"/>
                                   <wp:effectExtent l="0" t="0" r="0" b="0"/>
-                                  <wp:docPr id="54" name="Picture 6"/>
+                                  <wp:docPr id="53" name="Picture 5"/>
                                   <wp:cNvGraphicFramePr>
                                     <a:graphicFrameLocks xmlns:a="http://schemas.openxmlformats.org/drawingml/2006/main" noChangeAspect="1"/>
                                   </wp:cNvGraphicFramePr>
@@ -5523,13 +6145,13 @@
                                     <a:graphicData uri="http://schemas.openxmlformats.org/drawingml/2006/picture">
                                       <pic:pic xmlns:pic="http://schemas.openxmlformats.org/drawingml/2006/picture">
                                         <pic:nvPicPr>
-                                          <pic:cNvPr id="54" name="Picture 6"/>
+                                          <pic:cNvPr id="53" name="Picture 5"/>
                                           <pic:cNvPicPr>
                                             <a:picLocks noChangeAspect="1" noChangeArrowheads="1"/>
                                           </pic:cNvPicPr>
                                         </pic:nvPicPr>
                                         <pic:blipFill>
-                                          <a:blip r:embed="rId37"/>
+                                          <a:blip r:embed="rId36"/>
                                           <a:stretch>
                                             <a:fillRect/>
                                           </a:stretch>
@@ -5537,7 +6159,7 @@
                                         <pic:spPr bwMode="auto">
                                           <a:xfrm>
                                             <a:off x="0" y="0"/>
-                                            <a:ext cx="5029200" cy="3332480"/>
+                                            <a:ext cx="5029200" cy="2480945"/>
                                           </a:xfrm>
                                           <a:prstGeom prst="rect">
                                             <a:avLst/>
@@ -5590,7 +6212,7 @@
                               <w:rPr>
                                 <w:lang w:val="en-GB"/>
                               </w:rPr>
-                              <w:t>: Early Readmission Rate by Primary Diagnosis Category</w:t>
+                              <w:t>: Early Readmission Rate by Age Group</w:t>
                             </w:r>
                           </w:p>
                         </w:txbxContent>
@@ -5606,7 +6228,7 @@
           </mc:Choice>
           <mc:Fallback>
             <w:pict>
-              <v:rect id="shape_0" fillcolor="white" stroked="f" o:allowincell="f" style="position:absolute;margin-left:0pt;margin-top:-273.45pt;width:395.95pt;height:273.35pt;mso-wrap-style:square;v-text-anchor:top;mso-position-vertical:top">
+              <v:rect id="shape_0" fillcolor="white" stroked="f" o:allowincell="f" style="position:absolute;margin-left:0pt;margin-top:-206.4pt;width:395.95pt;height:206.3pt;mso-wrap-style:square;v-text-anchor:top;mso-position-vertical:top">
                 <v:fill o:detectmouseclick="t" type="solid" color2="black"/>
                 <v:stroke color="#3465a4" joinstyle="round" endcap="flat"/>
                 <v:textbox>
@@ -5624,9 +6246,9 @@
                         <w:rPr/>
                         <w:drawing>
                           <wp:inline distT="0" distB="0" distL="0" distR="0">
-                            <wp:extent cx="5029200" cy="3332480"/>
+                            <wp:extent cx="5029200" cy="2480945"/>
                             <wp:effectExtent l="0" t="0" r="0" b="0"/>
-                            <wp:docPr id="55" name="Picture 6"/>
+                            <wp:docPr id="54" name="Picture 5"/>
                             <wp:cNvGraphicFramePr>
                               <a:graphicFrameLocks xmlns:a="http://schemas.openxmlformats.org/drawingml/2006/main" noChangeAspect="1"/>
                             </wp:cNvGraphicFramePr>
@@ -5634,13 +6256,13 @@
                               <a:graphicData uri="http://schemas.openxmlformats.org/drawingml/2006/picture">
                                 <pic:pic xmlns:pic="http://schemas.openxmlformats.org/drawingml/2006/picture">
                                   <pic:nvPicPr>
-                                    <pic:cNvPr id="55" name="Picture 6"/>
+                                    <pic:cNvPr id="54" name="Picture 5"/>
                                     <pic:cNvPicPr>
                                       <a:picLocks noChangeAspect="1" noChangeArrowheads="1"/>
                                     </pic:cNvPicPr>
                                   </pic:nvPicPr>
                                   <pic:blipFill>
-                                    <a:blip r:embed="rId38"/>
+                                    <a:blip r:embed="rId37"/>
                                     <a:stretch>
                                       <a:fillRect/>
                                     </a:stretch>
@@ -5648,7 +6270,7 @@
                                   <pic:spPr bwMode="auto">
                                     <a:xfrm>
                                       <a:off x="0" y="0"/>
-                                      <a:ext cx="5029200" cy="3332480"/>
+                                      <a:ext cx="5029200" cy="2480945"/>
                                     </a:xfrm>
                                     <a:prstGeom prst="rect">
                                       <a:avLst/>
@@ -5701,7 +6323,7 @@
                         <w:rPr>
                           <w:lang w:val="en-GB"/>
                         </w:rPr>
-                        <w:t>: Early Readmission Rate by Primary Diagnosis Category</w:t>
+                        <w:t>: Early Readmission Rate by Age Group</w:t>
                       </w:r>
                     </w:p>
                   </w:txbxContent>
@@ -5725,7 +6347,19 @@
         <w:rPr>
           <w:lang w:val="en-GB"/>
         </w:rPr>
-        <w:t>Figure 19 focuses on diabetes and readmission rates, specifcally, how changes in Insulin Usage impacts it. Typically, a decreases in a patient’s insulin usage has the highest increase in their risk of readmission. At 9.8%, incresasing a patients insulin usage has a lesser impact on readmission risk than decreasing it, but still greater than keeping a steady usage. Patients that are not using insulin have lower readmission rates. This is likely because they do not suffer from diabetes, which has the third highest readmission rate (see Figure 18).</w:t>
+        <w:t>The early admission rate is also compared across diagnosis categories, defined during data cleaning (see Section 2.4). Figure 1</w:t>
+      </w:r>
+      <w:r>
+        <w:rPr>
+          <w:lang w:val="en-GB"/>
+        </w:rPr>
+        <w:t>9</w:t>
+      </w:r>
+      <w:r>
+        <w:rPr>
+          <w:lang w:val="en-GB"/>
+        </w:rPr>
+        <w:t xml:space="preserve"> shows that Injury, Circulatory and Diabetes issues lead to highest rates.</w:t>
       </w:r>
     </w:p>
     <w:p>
@@ -5742,9 +6376,9 @@
           <mc:Choice Requires="wps">
             <w:drawing>
               <wp:inline distT="0" distB="0" distL="0" distR="0">
-                <wp:extent cx="5029200" cy="3700145"/>
+                <wp:extent cx="5029200" cy="3472180"/>
                 <wp:effectExtent l="0" t="0" r="0" b="0"/>
-                <wp:docPr id="56" name="Frame19"/>
+                <wp:docPr id="55" name="Frame18"/>
                 <a:graphic xmlns:a="http://schemas.openxmlformats.org/drawingml/2006/main">
                   <a:graphicData uri="http://schemas.microsoft.com/office/word/2010/wordprocessingShape">
                     <wps:wsp>
@@ -5752,7 +6386,7 @@
                       <wps:spPr>
                         <a:xfrm>
                           <a:off x="0" y="0"/>
-                          <a:ext cx="5029200" cy="3700080"/>
+                          <a:ext cx="5029200" cy="3472200"/>
                         </a:xfrm>
                         <a:prstGeom prst="rect">
                           <a:avLst/>
@@ -5785,9 +6419,9 @@
                               <w:rPr/>
                               <w:drawing>
                                 <wp:inline distT="0" distB="0" distL="0" distR="0">
-                                  <wp:extent cx="5029200" cy="3560445"/>
+                                  <wp:extent cx="5029200" cy="3332480"/>
                                   <wp:effectExtent l="0" t="0" r="0" b="0"/>
-                                  <wp:docPr id="57" name="Picture 7"/>
+                                  <wp:docPr id="56" name="Picture 6"/>
                                   <wp:cNvGraphicFramePr>
                                     <a:graphicFrameLocks xmlns:a="http://schemas.openxmlformats.org/drawingml/2006/main" noChangeAspect="1"/>
                                   </wp:cNvGraphicFramePr>
@@ -5795,13 +6429,13 @@
                                     <a:graphicData uri="http://schemas.openxmlformats.org/drawingml/2006/picture">
                                       <pic:pic xmlns:pic="http://schemas.openxmlformats.org/drawingml/2006/picture">
                                         <pic:nvPicPr>
-                                          <pic:cNvPr id="57" name="Picture 7"/>
+                                          <pic:cNvPr id="56" name="Picture 6"/>
                                           <pic:cNvPicPr>
                                             <a:picLocks noChangeAspect="1" noChangeArrowheads="1"/>
                                           </pic:cNvPicPr>
                                         </pic:nvPicPr>
                                         <pic:blipFill>
-                                          <a:blip r:embed="rId39"/>
+                                          <a:blip r:embed="rId38"/>
                                           <a:stretch>
                                             <a:fillRect/>
                                           </a:stretch>
@@ -5809,7 +6443,7 @@
                                         <pic:spPr bwMode="auto">
                                           <a:xfrm>
                                             <a:off x="0" y="0"/>
-                                            <a:ext cx="5029200" cy="3560445"/>
+                                            <a:ext cx="5029200" cy="3332480"/>
                                           </a:xfrm>
                                           <a:prstGeom prst="rect">
                                             <a:avLst/>
@@ -5862,7 +6496,7 @@
                               <w:rPr>
                                 <w:lang w:val="en-GB"/>
                               </w:rPr>
-                              <w:t>: Early Readmission Rate by Insulin Usage</w:t>
+                              <w:t>: Early Readmission Rate by Primary Diagnosis Category</w:t>
                             </w:r>
                           </w:p>
                         </w:txbxContent>
@@ -5878,7 +6512,7 @@
           </mc:Choice>
           <mc:Fallback>
             <w:pict>
-              <v:rect id="shape_0" fillcolor="white" stroked="f" o:allowincell="f" style="position:absolute;margin-left:0pt;margin-top:-291.4pt;width:395.95pt;height:291.3pt;mso-wrap-style:square;v-text-anchor:top;mso-position-vertical:top">
+              <v:rect id="shape_0" fillcolor="white" stroked="f" o:allowincell="f" style="position:absolute;margin-left:0pt;margin-top:-273.45pt;width:395.95pt;height:273.35pt;mso-wrap-style:square;v-text-anchor:top;mso-position-vertical:top">
                 <v:fill o:detectmouseclick="t" type="solid" color2="black"/>
                 <v:stroke color="#3465a4" joinstyle="round" endcap="flat"/>
                 <v:textbox>
@@ -5896,9 +6530,9 @@
                         <w:rPr/>
                         <w:drawing>
                           <wp:inline distT="0" distB="0" distL="0" distR="0">
-                            <wp:extent cx="5029200" cy="3560445"/>
+                            <wp:extent cx="5029200" cy="3332480"/>
                             <wp:effectExtent l="0" t="0" r="0" b="0"/>
-                            <wp:docPr id="58" name="Picture 7"/>
+                            <wp:docPr id="57" name="Picture 6"/>
                             <wp:cNvGraphicFramePr>
                               <a:graphicFrameLocks xmlns:a="http://schemas.openxmlformats.org/drawingml/2006/main" noChangeAspect="1"/>
                             </wp:cNvGraphicFramePr>
@@ -5906,13 +6540,13 @@
                               <a:graphicData uri="http://schemas.openxmlformats.org/drawingml/2006/picture">
                                 <pic:pic xmlns:pic="http://schemas.openxmlformats.org/drawingml/2006/picture">
                                   <pic:nvPicPr>
-                                    <pic:cNvPr id="58" name="Picture 7"/>
+                                    <pic:cNvPr id="57" name="Picture 6"/>
                                     <pic:cNvPicPr>
                                       <a:picLocks noChangeAspect="1" noChangeArrowheads="1"/>
                                     </pic:cNvPicPr>
                                   </pic:nvPicPr>
                                   <pic:blipFill>
-                                    <a:blip r:embed="rId40"/>
+                                    <a:blip r:embed="rId39"/>
                                     <a:stretch>
                                       <a:fillRect/>
                                     </a:stretch>
@@ -5920,7 +6554,7 @@
                                   <pic:spPr bwMode="auto">
                                     <a:xfrm>
                                       <a:off x="0" y="0"/>
-                                      <a:ext cx="5029200" cy="3560445"/>
+                                      <a:ext cx="5029200" cy="3332480"/>
                                     </a:xfrm>
                                     <a:prstGeom prst="rect">
                                       <a:avLst/>
@@ -5973,6 +6607,326 @@
                         <w:rPr>
                           <w:lang w:val="en-GB"/>
                         </w:rPr>
+                        <w:t>: Early Readmission Rate by Primary Diagnosis Category</w:t>
+                      </w:r>
+                    </w:p>
+                  </w:txbxContent>
+                </v:textbox>
+                <w10:wrap type="square"/>
+              </v:rect>
+            </w:pict>
+          </mc:Fallback>
+        </mc:AlternateContent>
+      </w:r>
+    </w:p>
+    <w:p>
+      <w:pPr>
+        <w:pStyle w:val="Normal"/>
+        <w:jc w:val="start"/>
+        <w:rPr>
+          <w:lang w:val="en-GB"/>
+        </w:rPr>
+      </w:pPr>
+      <w:r>
+        <w:rPr>
+          <w:lang w:val="en-GB"/>
+        </w:rPr>
+        <w:t xml:space="preserve">Figure 19 focuses on diabetes and readmission rates, </w:t>
+      </w:r>
+      <w:r>
+        <w:rPr>
+          <w:lang w:val="en-GB"/>
+        </w:rPr>
+        <w:t xml:space="preserve">and the impact of </w:t>
+      </w:r>
+      <w:r>
+        <w:rPr>
+          <w:lang w:val="en-GB"/>
+        </w:rPr>
+        <w:t>changes in Insulin Usage. Typically, decreases in a patient’s insulin usage has the highest increas</w:t>
+      </w:r>
+      <w:r>
+        <w:rPr>
+          <w:lang w:val="en-GB"/>
+        </w:rPr>
+        <w:t>ing</w:t>
+      </w:r>
+      <w:r>
+        <w:rPr>
+          <w:lang w:val="en-GB"/>
+        </w:rPr>
+        <w:t xml:space="preserve"> risk of readmission. At 9.8%, incresasing insulin usage has a lesser impact on readmission risk than decreasing it, but greater than keeping a steady usage. Patients </w:t>
+      </w:r>
+      <w:r>
+        <w:rPr>
+          <w:lang w:val="en-GB"/>
+        </w:rPr>
+        <w:t>that do</w:t>
+      </w:r>
+      <w:r>
+        <w:rPr>
+          <w:lang w:val="en-GB"/>
+        </w:rPr>
+        <w:t xml:space="preserve"> not us</w:t>
+      </w:r>
+      <w:r>
+        <w:rPr>
+          <w:lang w:val="en-GB"/>
+        </w:rPr>
+        <w:t>e</w:t>
+      </w:r>
+      <w:r>
+        <w:rPr>
+          <w:lang w:val="en-GB"/>
+        </w:rPr>
+        <w:t xml:space="preserve"> insulin have lower readmission rates. This is likely because they do not suffer from diabetes, which has the third highest readmission rate.</w:t>
+      </w:r>
+    </w:p>
+    <w:p>
+      <w:pPr>
+        <w:pStyle w:val="Normal"/>
+        <w:jc w:val="center"/>
+        <w:rPr>
+          <w:lang w:val="en-GB"/>
+        </w:rPr>
+      </w:pPr>
+      <w:r>
+        <w:rPr/>
+        <mc:AlternateContent>
+          <mc:Choice Requires="wps">
+            <w:drawing>
+              <wp:inline distT="0" distB="0" distL="0" distR="0">
+                <wp:extent cx="5029200" cy="3700145"/>
+                <wp:effectExtent l="0" t="0" r="0" b="0"/>
+                <wp:docPr id="58" name="Frame19"/>
+                <a:graphic xmlns:a="http://schemas.openxmlformats.org/drawingml/2006/main">
+                  <a:graphicData uri="http://schemas.microsoft.com/office/word/2010/wordprocessingShape">
+                    <wps:wsp>
+                      <wps:cNvSpPr/>
+                      <wps:spPr>
+                        <a:xfrm>
+                          <a:off x="0" y="0"/>
+                          <a:ext cx="5029200" cy="3700080"/>
+                        </a:xfrm>
+                        <a:prstGeom prst="rect">
+                          <a:avLst/>
+                        </a:prstGeom>
+                        <a:solidFill>
+                          <a:srgbClr val="FFFFFF"/>
+                        </a:solidFill>
+                        <a:ln w="0">
+                          <a:noFill/>
+                        </a:ln>
+                      </wps:spPr>
+                      <wps:style>
+                        <a:lnRef idx="0"/>
+                        <a:fillRef idx="0"/>
+                        <a:effectRef idx="0"/>
+                        <a:fontRef idx="minor"/>
+                      </wps:style>
+                      <wps:txbx>
+                        <w:txbxContent>
+                          <w:p>
+                            <w:pPr>
+                              <w:pStyle w:val="Figure"/>
+                              <w:spacing w:before="0" w:after="200"/>
+                              <w:jc w:val="center"/>
+                              <w:rPr>
+                                <w:lang w:val="en-GB"/>
+                              </w:rPr>
+                            </w:pPr>
+                            <w:r>
+                              <w:rPr/>
+                              <w:drawing>
+                                <wp:inline distT="0" distB="0" distL="0" distR="0">
+                                  <wp:extent cx="5029200" cy="3560445"/>
+                                  <wp:effectExtent l="0" t="0" r="0" b="0"/>
+                                  <wp:docPr id="59" name="Picture 7"/>
+                                  <wp:cNvGraphicFramePr>
+                                    <a:graphicFrameLocks xmlns:a="http://schemas.openxmlformats.org/drawingml/2006/main" noChangeAspect="1"/>
+                                  </wp:cNvGraphicFramePr>
+                                  <a:graphic xmlns:a="http://schemas.openxmlformats.org/drawingml/2006/main">
+                                    <a:graphicData uri="http://schemas.openxmlformats.org/drawingml/2006/picture">
+                                      <pic:pic xmlns:pic="http://schemas.openxmlformats.org/drawingml/2006/picture">
+                                        <pic:nvPicPr>
+                                          <pic:cNvPr id="59" name="Picture 7"/>
+                                          <pic:cNvPicPr>
+                                            <a:picLocks noChangeAspect="1" noChangeArrowheads="1"/>
+                                          </pic:cNvPicPr>
+                                        </pic:nvPicPr>
+                                        <pic:blipFill>
+                                          <a:blip r:embed="rId40"/>
+                                          <a:stretch>
+                                            <a:fillRect/>
+                                          </a:stretch>
+                                        </pic:blipFill>
+                                        <pic:spPr bwMode="auto">
+                                          <a:xfrm>
+                                            <a:off x="0" y="0"/>
+                                            <a:ext cx="5029200" cy="3560445"/>
+                                          </a:xfrm>
+                                          <a:prstGeom prst="rect">
+                                            <a:avLst/>
+                                          </a:prstGeom>
+                                          <a:noFill/>
+                                        </pic:spPr>
+                                      </pic:pic>
+                                    </a:graphicData>
+                                  </a:graphic>
+                                </wp:inline>
+                              </w:drawing>
+                            </w:r>
+                            <w:r>
+                              <w:rPr>
+                                <w:lang w:val="en-GB"/>
+                              </w:rPr>
+                              <w:t xml:space="preserve">Figure </w:t>
+                            </w:r>
+                            <w:r>
+                              <w:rPr>
+                                <w:lang w:val="en-GB"/>
+                              </w:rPr>
+                              <w:fldChar w:fldCharType="begin"/>
+                            </w:r>
+                            <w:r>
+                              <w:rPr>
+                                <w:lang w:val="en-GB"/>
+                              </w:rPr>
+                              <w:instrText xml:space="preserve"> SEQ Figure \* ARABIC </w:instrText>
+                            </w:r>
+                            <w:r>
+                              <w:rPr>
+                                <w:lang w:val="en-GB"/>
+                              </w:rPr>
+                              <w:fldChar w:fldCharType="separate"/>
+                            </w:r>
+                            <w:r>
+                              <w:rPr>
+                                <w:lang w:val="en-GB"/>
+                              </w:rPr>
+                              <w:t>20</w:t>
+                            </w:r>
+                            <w:r>
+                              <w:rPr>
+                                <w:lang w:val="en-GB"/>
+                              </w:rPr>
+                              <w:fldChar w:fldCharType="end"/>
+                            </w:r>
+                            <w:r>
+                              <w:rPr>
+                                <w:lang w:val="en-GB"/>
+                              </w:rPr>
+                              <w:t>: Early Readmission Rate by Insulin Usage</w:t>
+                            </w:r>
+                          </w:p>
+                        </w:txbxContent>
+                      </wps:txbx>
+                      <wps:bodyPr lIns="0" tIns="0" rIns="0" bIns="0" anchor="t">
+                        <a:noAutofit/>
+                      </wps:bodyPr>
+                    </wps:wsp>
+                  </a:graphicData>
+                </a:graphic>
+              </wp:inline>
+            </w:drawing>
+          </mc:Choice>
+          <mc:Fallback>
+            <w:pict>
+              <v:rect id="shape_0" fillcolor="white" stroked="f" o:allowincell="f" style="position:absolute;margin-left:0pt;margin-top:-291.4pt;width:395.95pt;height:291.3pt;mso-wrap-style:square;v-text-anchor:top;mso-position-vertical:top">
+                <v:fill o:detectmouseclick="t" type="solid" color2="black"/>
+                <v:stroke color="#3465a4" joinstyle="round" endcap="flat"/>
+                <v:textbox>
+                  <w:txbxContent>
+                    <w:p>
+                      <w:pPr>
+                        <w:pStyle w:val="Figure"/>
+                        <w:spacing w:before="0" w:after="200"/>
+                        <w:jc w:val="center"/>
+                        <w:rPr>
+                          <w:lang w:val="en-GB"/>
+                        </w:rPr>
+                      </w:pPr>
+                      <w:r>
+                        <w:rPr/>
+                        <w:drawing>
+                          <wp:inline distT="0" distB="0" distL="0" distR="0">
+                            <wp:extent cx="5029200" cy="3560445"/>
+                            <wp:effectExtent l="0" t="0" r="0" b="0"/>
+                            <wp:docPr id="60" name="Picture 7"/>
+                            <wp:cNvGraphicFramePr>
+                              <a:graphicFrameLocks xmlns:a="http://schemas.openxmlformats.org/drawingml/2006/main" noChangeAspect="1"/>
+                            </wp:cNvGraphicFramePr>
+                            <a:graphic xmlns:a="http://schemas.openxmlformats.org/drawingml/2006/main">
+                              <a:graphicData uri="http://schemas.openxmlformats.org/drawingml/2006/picture">
+                                <pic:pic xmlns:pic="http://schemas.openxmlformats.org/drawingml/2006/picture">
+                                  <pic:nvPicPr>
+                                    <pic:cNvPr id="60" name="Picture 7"/>
+                                    <pic:cNvPicPr>
+                                      <a:picLocks noChangeAspect="1" noChangeArrowheads="1"/>
+                                    </pic:cNvPicPr>
+                                  </pic:nvPicPr>
+                                  <pic:blipFill>
+                                    <a:blip r:embed="rId41"/>
+                                    <a:stretch>
+                                      <a:fillRect/>
+                                    </a:stretch>
+                                  </pic:blipFill>
+                                  <pic:spPr bwMode="auto">
+                                    <a:xfrm>
+                                      <a:off x="0" y="0"/>
+                                      <a:ext cx="5029200" cy="3560445"/>
+                                    </a:xfrm>
+                                    <a:prstGeom prst="rect">
+                                      <a:avLst/>
+                                    </a:prstGeom>
+                                    <a:noFill/>
+                                  </pic:spPr>
+                                </pic:pic>
+                              </a:graphicData>
+                            </a:graphic>
+                          </wp:inline>
+                        </w:drawing>
+                      </w:r>
+                      <w:r>
+                        <w:rPr>
+                          <w:lang w:val="en-GB"/>
+                        </w:rPr>
+                        <w:t xml:space="preserve">Figure </w:t>
+                      </w:r>
+                      <w:r>
+                        <w:rPr>
+                          <w:lang w:val="en-GB"/>
+                        </w:rPr>
+                        <w:fldChar w:fldCharType="begin"/>
+                      </w:r>
+                      <w:r>
+                        <w:rPr>
+                          <w:lang w:val="en-GB"/>
+                        </w:rPr>
+                        <w:instrText xml:space="preserve"> SEQ Figure \* ARABIC </w:instrText>
+                      </w:r>
+                      <w:r>
+                        <w:rPr>
+                          <w:lang w:val="en-GB"/>
+                        </w:rPr>
+                        <w:fldChar w:fldCharType="separate"/>
+                      </w:r>
+                      <w:r>
+                        <w:rPr>
+                          <w:lang w:val="en-GB"/>
+                        </w:rPr>
+                        <w:t>20</w:t>
+                      </w:r>
+                      <w:r>
+                        <w:rPr>
+                          <w:lang w:val="en-GB"/>
+                        </w:rPr>
+                        <w:fldChar w:fldCharType="end"/>
+                      </w:r>
+                      <w:r>
+                        <w:rPr>
+                          <w:lang w:val="en-GB"/>
+                        </w:rPr>
                         <w:t>: Early Readmission Rate by Insulin Usage</w:t>
                       </w:r>
                     </w:p>
@@ -6001,7 +6955,29 @@
           <w:szCs w:val="22"/>
           <w:lang w:val="en-GB"/>
         </w:rPr>
-        <w:t>After permorming EDA, relationships between existing features can be exploited to “Engineer” additional features from the dataset.</w:t>
+        <w:t xml:space="preserve">After EDA, relationships between existing features can be </w:t>
+      </w:r>
+      <w:r>
+        <w:rPr>
+          <w:b w:val="false"/>
+          <w:bCs w:val="false"/>
+          <w:color w:val="000000"/>
+          <w:sz w:val="22"/>
+          <w:szCs w:val="22"/>
+          <w:lang w:val="en-GB"/>
+        </w:rPr>
+        <w:t>used</w:t>
+      </w:r>
+      <w:r>
+        <w:rPr>
+          <w:b w:val="false"/>
+          <w:bCs w:val="false"/>
+          <w:color w:val="000000"/>
+          <w:sz w:val="22"/>
+          <w:szCs w:val="22"/>
+          <w:lang w:val="en-GB"/>
+        </w:rPr>
+        <w:t xml:space="preserve"> to “Engineer” additional features.</w:t>
       </w:r>
       <w:r>
         <w:rPr>
@@ -6036,7 +7012,43 @@
         <w:rPr>
           <w:lang w:val="en-GB"/>
         </w:rPr>
-        <w:t>Section 3.2 identified number_inpatient as the strongest individual predictor of early readmission, consistent with Jencks et al. (2009)[4]. The new feature “has_prior_inpatient” combines all inpatient visits recorded into one flag: any prior hospitalisation versus none. This is more meaninful than the raw count, because the existence of prior admissions is more significant than the exact number. The three prior visits columns are aggregated into one feature. This reduces multicollinearity between the three columns, allowing for fewer training variables and faster training times for Machine Learning.</w:t>
+        <w:t xml:space="preserve">Section 3.2 identified number_inpatient as the strongest predictor of early readmission, consistent with Jencks et al. (2009)[4]. The new feature “has_prior_inpatient” combines all inpatient visits into one flag: any prior hospitalisation versus none. </w:t>
+      </w:r>
+      <w:r>
+        <w:rPr>
+          <w:lang w:val="en-GB"/>
+        </w:rPr>
+        <w:t>T</w:t>
+      </w:r>
+      <w:r>
+        <w:rPr>
+          <w:lang w:val="en-GB"/>
+        </w:rPr>
+        <w:t xml:space="preserve">he existence of prior admissions is more significant than the </w:t>
+      </w:r>
+      <w:r>
+        <w:rPr>
+          <w:lang w:val="en-GB"/>
+        </w:rPr>
+        <w:t>total count</w:t>
+      </w:r>
+      <w:r>
+        <w:rPr>
+          <w:lang w:val="en-GB"/>
+        </w:rPr>
+        <w:t xml:space="preserve">. The three prior visits columns are aggregated into one feature. This reduces multicollinearity, allowing for fewer training variables and faster </w:t>
+      </w:r>
+      <w:r>
+        <w:rPr>
+          <w:lang w:val="en-GB"/>
+        </w:rPr>
+        <w:t xml:space="preserve">model </w:t>
+      </w:r>
+      <w:r>
+        <w:rPr>
+          <w:lang w:val="en-GB"/>
+        </w:rPr>
+        <w:t>training times.</w:t>
       </w:r>
     </w:p>
     <w:p>
@@ -6060,7 +7072,19 @@
         <w:rPr>
           <w:lang w:val="en-GB"/>
         </w:rPr>
-        <w:t>EDA showed that time_in_hospital correlates weakly with readmission despite its clinical plausibility. The confound is that longer stays naturally increases procedures and medications, inflating raw counts.. Dividing by stay length + 1 produces per-day ratios that measure how actively a patient was managed relative to their stay.</w:t>
+        <w:t xml:space="preserve">EDA showed that time_in_hospital correlates weakly with readmission despite its clinical plausibility. The confound is that longer stays naturally increase procedures and medications, inflating </w:t>
+      </w:r>
+      <w:r>
+        <w:rPr>
+          <w:lang w:val="en-GB"/>
+        </w:rPr>
+        <w:t>totals</w:t>
+      </w:r>
+      <w:r>
+        <w:rPr>
+          <w:lang w:val="en-GB"/>
+        </w:rPr>
+        <w:t>. Dividing by stay length + 1 produces per-day ratios that measure how actively a patient was managed relative to their stay.</w:t>
       </w:r>
     </w:p>
     <w:p>
@@ -6074,7 +7098,7 @@
         <mc:AlternateContent>
           <mc:Choice Requires="wps">
             <w:drawing>
-              <wp:anchor distT="0" distB="0" distL="0" distR="0" simplePos="0" relativeHeight="60" behindDoc="0" locked="0" layoutInCell="0" allowOverlap="1">
+              <wp:anchor distT="0" distB="0" distL="0" distR="0" simplePos="0" relativeHeight="59" behindDoc="0" locked="0" layoutInCell="0" allowOverlap="1">
                 <wp:simplePos x="0" y="0"/>
                 <wp:positionH relativeFrom="column">
                   <wp:align>center</wp:align>
@@ -6085,7 +7109,7 @@
                 <wp:extent cx="5972810" cy="715645"/>
                 <wp:effectExtent l="0" t="0" r="0" b="0"/>
                 <wp:wrapSquare wrapText="largest"/>
-                <wp:docPr id="59" name="Frame20"/>
+                <wp:docPr id="61" name="Frame20"/>
                 <a:graphic xmlns:a="http://schemas.openxmlformats.org/drawingml/2006/main">
                   <a:graphicData uri="http://schemas.microsoft.com/office/word/2010/wordprocessingShape">
                     <wps:wsp>
@@ -6126,7 +7150,7 @@
                                 <wp:inline distT="0" distB="0" distL="0" distR="0">
                                   <wp:extent cx="5972810" cy="575945"/>
                                   <wp:effectExtent l="0" t="0" r="0" b="0"/>
-                                  <wp:docPr id="60" name="Image1 Copy 1"/>
+                                  <wp:docPr id="62" name="Image1 Copy 1"/>
                                   <wp:cNvGraphicFramePr>
                                     <a:graphicFrameLocks xmlns:a="http://schemas.openxmlformats.org/drawingml/2006/main" noChangeAspect="1"/>
                                   </wp:cNvGraphicFramePr>
@@ -6134,13 +7158,13 @@
                                     <a:graphicData uri="http://schemas.openxmlformats.org/drawingml/2006/picture">
                                       <pic:pic xmlns:pic="http://schemas.openxmlformats.org/drawingml/2006/picture">
                                         <pic:nvPicPr>
-                                          <pic:cNvPr id="60" name="Image1 Copy 1"/>
+                                          <pic:cNvPr id="62" name="Image1 Copy 1"/>
                                           <pic:cNvPicPr>
                                             <a:picLocks noChangeAspect="1" noChangeArrowheads="1"/>
                                           </pic:cNvPicPr>
                                         </pic:nvPicPr>
                                         <pic:blipFill>
-                                          <a:blip r:embed="rId41"/>
+                                          <a:blip r:embed="rId42"/>
                                           <a:stretch>
                                             <a:fillRect/>
                                           </a:stretch>
@@ -6179,7 +7203,7 @@
                             </w:r>
                             <w:r>
                               <w:rPr/>
-                              <w:t>20</w:t>
+                              <w:t>21</w:t>
                             </w:r>
                             <w:r>
                               <w:rPr/>
@@ -6221,7 +7245,7 @@
                           <wp:inline distT="0" distB="0" distL="0" distR="0">
                             <wp:extent cx="5972810" cy="575945"/>
                             <wp:effectExtent l="0" t="0" r="0" b="0"/>
-                            <wp:docPr id="61" name="Image1 Copy 1"/>
+                            <wp:docPr id="63" name="Image1 Copy 1"/>
                             <wp:cNvGraphicFramePr>
                               <a:graphicFrameLocks xmlns:a="http://schemas.openxmlformats.org/drawingml/2006/main" noChangeAspect="1"/>
                             </wp:cNvGraphicFramePr>
@@ -6229,13 +7253,13 @@
                               <a:graphicData uri="http://schemas.openxmlformats.org/drawingml/2006/picture">
                                 <pic:pic xmlns:pic="http://schemas.openxmlformats.org/drawingml/2006/picture">
                                   <pic:nvPicPr>
-                                    <pic:cNvPr id="61" name="Image1 Copy 1"/>
+                                    <pic:cNvPr id="63" name="Image1 Copy 1"/>
                                     <pic:cNvPicPr>
                                       <a:picLocks noChangeAspect="1" noChangeArrowheads="1"/>
                                     </pic:cNvPicPr>
                                   </pic:nvPicPr>
                                   <pic:blipFill>
-                                    <a:blip r:embed="rId42"/>
+                                    <a:blip r:embed="rId43"/>
                                     <a:stretch>
                                       <a:fillRect/>
                                     </a:stretch>
@@ -6274,7 +7298,7 @@
                       </w:r>
                       <w:r>
                         <w:rPr/>
-                        <w:t>20</w:t>
+                        <w:t>21</w:t>
                       </w:r>
                       <w:r>
                         <w:rPr/>
@@ -6307,7 +7331,11 @@
       </w:pPr>
       <w:r>
         <w:rPr/>
-        <w:t>28 new features were created to capture risks that single data points miss. For example, "premature_discharge_risk" flags patients with both a short stay and reduced insulin. This is shown below:</w:t>
+        <w:t xml:space="preserve">28 new features were created to capture risks that single data points miss. For example, "premature_discharge_risk" flags patients with both a short stay and reduced insulin. </w:t>
+      </w:r>
+      <w:r>
+        <w:rPr/>
+        <w:t>See Figure 22.</w:t>
       </w:r>
     </w:p>
     <w:p>
@@ -6320,7 +7348,7 @@
         <mc:AlternateContent>
           <mc:Choice Requires="wps">
             <w:drawing>
-              <wp:anchor distT="0" distB="0" distL="0" distR="0" simplePos="0" relativeHeight="63" behindDoc="0" locked="0" layoutInCell="0" allowOverlap="1">
+              <wp:anchor distT="0" distB="0" distL="0" distR="0" simplePos="0" relativeHeight="62" behindDoc="0" locked="0" layoutInCell="0" allowOverlap="1">
                 <wp:simplePos x="0" y="0"/>
                 <wp:positionH relativeFrom="column">
                   <wp:align>center</wp:align>
@@ -6331,7 +7359,7 @@
                 <wp:extent cx="5019675" cy="768350"/>
                 <wp:effectExtent l="0" t="0" r="0" b="0"/>
                 <wp:wrapSquare wrapText="largest"/>
-                <wp:docPr id="62" name="Frame21"/>
+                <wp:docPr id="64" name="Frame21"/>
                 <a:graphic xmlns:a="http://schemas.openxmlformats.org/drawingml/2006/main">
                   <a:graphicData uri="http://schemas.microsoft.com/office/word/2010/wordprocessingShape">
                     <wps:wsp>
@@ -6372,7 +7400,7 @@
                                 <wp:inline distT="0" distB="0" distL="0" distR="0">
                                   <wp:extent cx="5019675" cy="628650"/>
                                   <wp:effectExtent l="0" t="0" r="0" b="0"/>
-                                  <wp:docPr id="63" name="Image14"/>
+                                  <wp:docPr id="65" name="Image14"/>
                                   <wp:cNvGraphicFramePr>
                                     <a:graphicFrameLocks xmlns:a="http://schemas.openxmlformats.org/drawingml/2006/main" noChangeAspect="1"/>
                                   </wp:cNvGraphicFramePr>
@@ -6380,13 +7408,13 @@
                                     <a:graphicData uri="http://schemas.openxmlformats.org/drawingml/2006/picture">
                                       <pic:pic xmlns:pic="http://schemas.openxmlformats.org/drawingml/2006/picture">
                                         <pic:nvPicPr>
-                                          <pic:cNvPr id="63" name="Image14"/>
+                                          <pic:cNvPr id="65" name="Image14"/>
                                           <pic:cNvPicPr>
                                             <a:picLocks noChangeAspect="1" noChangeArrowheads="1"/>
                                           </pic:cNvPicPr>
                                         </pic:nvPicPr>
                                         <pic:blipFill>
-                                          <a:blip r:embed="rId43"/>
+                                          <a:blip r:embed="rId44"/>
                                           <a:stretch>
                                             <a:fillRect/>
                                           </a:stretch>
@@ -6425,7 +7453,7 @@
                             </w:r>
                             <w:r>
                               <w:rPr/>
-                              <w:t>21</w:t>
+                              <w:t>22</w:t>
                             </w:r>
                             <w:r>
                               <w:rPr/>
@@ -6467,7 +7495,7 @@
                           <wp:inline distT="0" distB="0" distL="0" distR="0">
                             <wp:extent cx="5019675" cy="628650"/>
                             <wp:effectExtent l="0" t="0" r="0" b="0"/>
-                            <wp:docPr id="64" name="Image14"/>
+                            <wp:docPr id="66" name="Image14"/>
                             <wp:cNvGraphicFramePr>
                               <a:graphicFrameLocks xmlns:a="http://schemas.openxmlformats.org/drawingml/2006/main" noChangeAspect="1"/>
                             </wp:cNvGraphicFramePr>
@@ -6475,13 +7503,13 @@
                               <a:graphicData uri="http://schemas.openxmlformats.org/drawingml/2006/picture">
                                 <pic:pic xmlns:pic="http://schemas.openxmlformats.org/drawingml/2006/picture">
                                   <pic:nvPicPr>
-                                    <pic:cNvPr id="64" name="Image14"/>
+                                    <pic:cNvPr id="66" name="Image14"/>
                                     <pic:cNvPicPr>
                                       <a:picLocks noChangeAspect="1" noChangeArrowheads="1"/>
                                     </pic:cNvPicPr>
                                   </pic:nvPicPr>
                                   <pic:blipFill>
-                                    <a:blip r:embed="rId44"/>
+                                    <a:blip r:embed="rId45"/>
                                     <a:stretch>
                                       <a:fillRect/>
                                     </a:stretch>
@@ -6520,7 +7548,7 @@
                       </w:r>
                       <w:r>
                         <w:rPr/>
-                        <w:t>21</w:t>
+                        <w:t>22</w:t>
                       </w:r>
                       <w:r>
                         <w:rPr/>
@@ -6557,7 +7585,7 @@
       </w:pPr>
       <w:r>
         <w:rPr/>
-        <w:t>In total, 67 features were used in training, including:</w:t>
+        <w:t>In total, 67 features were used in training:</w:t>
       </w:r>
     </w:p>
     <w:p>
@@ -6669,7 +7697,19 @@
         <w:rPr>
           <w:lang w:val="en-GB"/>
         </w:rPr>
-        <w:t>Three models were chosen, shown in Table 1.</w:t>
+        <w:t xml:space="preserve">Three models were chosen, shown in Table </w:t>
+      </w:r>
+      <w:r>
+        <w:rPr>
+          <w:lang w:val="en-GB"/>
+        </w:rPr>
+        <w:t>2</w:t>
+      </w:r>
+      <w:r>
+        <w:rPr>
+          <w:lang w:val="en-GB"/>
+        </w:rPr>
+        <w:t>.</w:t>
       </w:r>
     </w:p>
     <w:tbl>
@@ -7214,7 +8254,7 @@
       </w:r>
       <w:r>
         <w:rPr/>
-        <w:t>1</w:t>
+        <w:t>2</w:t>
       </w:r>
       <w:r>
         <w:rPr/>
@@ -7236,7 +8276,55 @@
         <w:rPr>
           <w:lang w:val="en-GB"/>
         </w:rPr>
-        <w:t xml:space="preserve">Gradient Boosting [3] builds trees sequentially, each correcting previous errors, progressively focusing on minority-class patients and non-linear interactions. Logistic Regression provides a linear baseline, but cannot capture these interactions. Random Forest achieves comparable discrimination to GB but lacks capabilities that concentrates training on difficult cases. </w:t>
+        <w:t>G</w:t>
+      </w:r>
+      <w:r>
+        <w:rPr>
+          <w:lang w:val="en-GB"/>
+        </w:rPr>
+        <w:t>B</w:t>
+      </w:r>
+      <w:r>
+        <w:rPr>
+          <w:lang w:val="en-GB"/>
+        </w:rPr>
+        <w:t xml:space="preserve"> builds trees sequentially, each correcting previous errors, progressively focusing on minority-class patients and non-linear interactions. L</w:t>
+      </w:r>
+      <w:r>
+        <w:rPr>
+          <w:lang w:val="en-GB"/>
+        </w:rPr>
+        <w:t>R</w:t>
+      </w:r>
+      <w:r>
+        <w:rPr>
+          <w:lang w:val="en-GB"/>
+        </w:rPr>
+        <w:t xml:space="preserve"> provides a linear baseline, but cannot capture </w:t>
+      </w:r>
+      <w:r>
+        <w:rPr>
+          <w:lang w:val="en-GB"/>
+        </w:rPr>
+        <w:t>non-linear</w:t>
+      </w:r>
+      <w:r>
+        <w:rPr>
+          <w:lang w:val="en-GB"/>
+        </w:rPr>
+        <w:t xml:space="preserve"> interactions. R</w:t>
+      </w:r>
+      <w:r>
+        <w:rPr>
+          <w:lang w:val="en-GB"/>
+        </w:rPr>
+        <w:t xml:space="preserve">F </w:t>
+      </w:r>
+      <w:r>
+        <w:rPr>
+          <w:lang w:val="en-GB"/>
+        </w:rPr>
+        <w:t xml:space="preserve">achieves comparable discrimination to GB but lacks capabilities that concentrates training on difficult cases. </w:t>
       </w:r>
     </w:p>
     <w:p>
@@ -7281,7 +8369,7 @@
         <mc:AlternateContent>
           <mc:Choice Requires="wps">
             <w:drawing>
-              <wp:anchor distT="0" distB="0" distL="0" distR="0" simplePos="0" relativeHeight="66" behindDoc="0" locked="0" layoutInCell="0" allowOverlap="1">
+              <wp:anchor distT="0" distB="0" distL="0" distR="0" simplePos="0" relativeHeight="65" behindDoc="0" locked="0" layoutInCell="0" allowOverlap="1">
                 <wp:simplePos x="0" y="0"/>
                 <wp:positionH relativeFrom="column">
                   <wp:align>center</wp:align>
@@ -7292,7 +8380,7 @@
                 <wp:extent cx="4676140" cy="5920740"/>
                 <wp:effectExtent l="0" t="0" r="0" b="0"/>
                 <wp:wrapSquare wrapText="left"/>
-                <wp:docPr id="65" name="Frame22"/>
+                <wp:docPr id="67" name="Frame22"/>
                 <a:graphic xmlns:a="http://schemas.openxmlformats.org/drawingml/2006/main">
                   <a:graphicData uri="http://schemas.microsoft.com/office/word/2010/wordprocessingShape">
                     <wps:wsp>
@@ -7333,7 +8421,7 @@
                                 <wp:inline distT="0" distB="0" distL="0" distR="0">
                                   <wp:extent cx="4676140" cy="5781040"/>
                                   <wp:effectExtent l="0" t="0" r="0" b="0"/>
-                                  <wp:docPr id="66" name="Image15"/>
+                                  <wp:docPr id="68" name="Image15"/>
                                   <wp:cNvGraphicFramePr>
                                     <a:graphicFrameLocks xmlns:a="http://schemas.openxmlformats.org/drawingml/2006/main" noChangeAspect="1"/>
                                   </wp:cNvGraphicFramePr>
@@ -7341,13 +8429,13 @@
                                     <a:graphicData uri="http://schemas.openxmlformats.org/drawingml/2006/picture">
                                       <pic:pic xmlns:pic="http://schemas.openxmlformats.org/drawingml/2006/picture">
                                         <pic:nvPicPr>
-                                          <pic:cNvPr id="66" name="Image15"/>
+                                          <pic:cNvPr id="68" name="Image15"/>
                                           <pic:cNvPicPr>
                                             <a:picLocks noChangeAspect="1" noChangeArrowheads="1"/>
                                           </pic:cNvPicPr>
                                         </pic:nvPicPr>
                                         <pic:blipFill>
-                                          <a:blip r:embed="rId45"/>
+                                          <a:blip r:embed="rId46"/>
                                           <a:stretch>
                                             <a:fillRect/>
                                           </a:stretch>
@@ -7386,7 +8474,7 @@
                             </w:r>
                             <w:r>
                               <w:rPr/>
-                              <w:t>22</w:t>
+                              <w:t>23</w:t>
                             </w:r>
                             <w:r>
                               <w:rPr/>
@@ -7428,7 +8516,7 @@
                           <wp:inline distT="0" distB="0" distL="0" distR="0">
                             <wp:extent cx="4676140" cy="5781040"/>
                             <wp:effectExtent l="0" t="0" r="0" b="0"/>
-                            <wp:docPr id="67" name="Image15"/>
+                            <wp:docPr id="69" name="Image15"/>
                             <wp:cNvGraphicFramePr>
                               <a:graphicFrameLocks xmlns:a="http://schemas.openxmlformats.org/drawingml/2006/main" noChangeAspect="1"/>
                             </wp:cNvGraphicFramePr>
@@ -7436,13 +8524,13 @@
                               <a:graphicData uri="http://schemas.openxmlformats.org/drawingml/2006/picture">
                                 <pic:pic xmlns:pic="http://schemas.openxmlformats.org/drawingml/2006/picture">
                                   <pic:nvPicPr>
-                                    <pic:cNvPr id="67" name="Image15"/>
+                                    <pic:cNvPr id="69" name="Image15"/>
                                     <pic:cNvPicPr>
                                       <a:picLocks noChangeAspect="1" noChangeArrowheads="1"/>
                                     </pic:cNvPicPr>
                                   </pic:nvPicPr>
                                   <pic:blipFill>
-                                    <a:blip r:embed="rId46"/>
+                                    <a:blip r:embed="rId47"/>
                                     <a:stretch>
                                       <a:fillRect/>
                                     </a:stretch>
@@ -7481,7 +8569,7 @@
                       </w:r>
                       <w:r>
                         <w:rPr/>
-                        <w:t>22</w:t>
+                        <w:t>23</w:t>
                       </w:r>
                       <w:r>
                         <w:rPr/>
@@ -7749,11 +8837,12 @@
               <w:spacing w:lineRule="auto" w:line="240" w:before="0" w:after="0"/>
               <w:jc w:val="start"/>
               <w:rPr>
-                <w:lang w:val="en-GB"/>
+                <w:color w:val="000000"/>
               </w:rPr>
             </w:pPr>
             <w:r>
               <w:rPr>
+                <w:color w:val="000000"/>
                 <w:lang w:val="en-GB"/>
               </w:rPr>
               <w:t>Inflated by 91% majority class; not primary metric</w:t>
@@ -7842,13 +8931,13 @@
               <w:spacing w:lineRule="auto" w:line="240" w:before="0" w:after="0"/>
               <w:jc w:val="start"/>
               <w:rPr>
-                <w:lang w:val="en-GB"/>
+                <w:color w:val="000000"/>
               </w:rPr>
             </w:pPr>
             <w:r>
               <w:rPr>
                 <w:rFonts w:eastAsia="ＭＳ 明朝" w:cs=""/>
-                <w:color w:themeColor="accent1" w:themeShade="bf" w:val="365F91"/>
+                <w:color w:val="000000"/>
                 <w:kern w:val="0"/>
                 <w:szCs w:val="22"/>
                 <w:lang w:val="en-GB" w:eastAsia="en-US" w:bidi="ar-SA"/>
@@ -7942,13 +9031,13 @@
               <w:spacing w:lineRule="auto" w:line="240" w:before="0" w:after="0"/>
               <w:jc w:val="start"/>
               <w:rPr>
-                <w:lang w:val="en-GB"/>
+                <w:color w:val="000000"/>
               </w:rPr>
             </w:pPr>
             <w:r>
               <w:rPr>
                 <w:rFonts w:eastAsia="ＭＳ 明朝" w:cs=""/>
-                <w:color w:themeColor="accent1" w:themeShade="bf" w:val="365F91"/>
+                <w:color w:val="000000"/>
                 <w:kern w:val="0"/>
                 <w:szCs w:val="22"/>
                 <w:lang w:val="en-GB" w:eastAsia="en-US" w:bidi="ar-SA"/>
@@ -8039,11 +9128,12 @@
               <w:spacing w:lineRule="auto" w:line="240" w:before="0" w:after="0"/>
               <w:jc w:val="start"/>
               <w:rPr>
-                <w:lang w:val="en-GB"/>
+                <w:color w:val="000000"/>
               </w:rPr>
             </w:pPr>
             <w:r>
               <w:rPr>
+                <w:color w:val="000000"/>
                 <w:lang w:val="en-GB"/>
               </w:rPr>
               <w:t>Reflects 8.9% base rate; 1.9× improvement over random baseline (0.089)</w:t>
@@ -8135,13 +9225,13 @@
               <w:spacing w:lineRule="auto" w:line="240" w:before="0" w:after="0"/>
               <w:jc w:val="start"/>
               <w:rPr>
-                <w:lang w:val="en-GB"/>
+                <w:color w:val="000000"/>
               </w:rPr>
             </w:pPr>
             <w:r>
               <w:rPr>
                 <w:rFonts w:eastAsia="ＭＳ 明朝" w:cs=""/>
-                <w:color w:themeColor="accent1" w:themeShade="bf" w:val="365F91"/>
+                <w:color w:val="000000"/>
                 <w:kern w:val="0"/>
                 <w:szCs w:val="22"/>
                 <w:lang w:val="en-GB" w:eastAsia="en-US" w:bidi="ar-SA"/>
@@ -8232,13 +9322,13 @@
               <w:spacing w:lineRule="auto" w:line="240" w:before="0" w:after="0"/>
               <w:jc w:val="start"/>
               <w:rPr>
-                <w:lang w:val="en-GB"/>
+                <w:color w:val="000000"/>
               </w:rPr>
             </w:pPr>
             <w:r>
               <w:rPr>
                 <w:rFonts w:eastAsia="ＭＳ 明朝" w:cs=""/>
-                <w:color w:themeColor="accent1" w:themeShade="bf" w:val="365F91"/>
+                <w:color w:val="000000"/>
                 <w:kern w:val="0"/>
                 <w:szCs w:val="22"/>
                 <w:lang w:val="en-GB" w:eastAsia="en-US" w:bidi="ar-SA"/>
@@ -8329,13 +9419,13 @@
               <w:spacing w:lineRule="auto" w:line="240" w:before="0" w:after="0"/>
               <w:jc w:val="start"/>
               <w:rPr>
-                <w:lang w:val="en-GB"/>
+                <w:color w:val="000000"/>
               </w:rPr>
             </w:pPr>
             <w:r>
               <w:rPr>
                 <w:rFonts w:eastAsia="ＭＳ 明朝" w:cs=""/>
-                <w:color w:themeColor="accent1" w:themeShade="bf" w:val="365F91"/>
+                <w:color w:val="000000"/>
                 <w:kern w:val="0"/>
                 <w:szCs w:val="22"/>
                 <w:lang w:val="en-GB" w:eastAsia="en-US" w:bidi="ar-SA"/>
@@ -8370,7 +9460,7 @@
       </w:r>
       <w:r>
         <w:rPr/>
-        <w:t>2</w:t>
+        <w:t>3</w:t>
       </w:r>
       <w:r>
         <w:rPr/>
@@ -8393,7 +9483,19 @@
         <w:rPr>
           <w:lang w:val="en-GB"/>
         </w:rPr>
-        <w:t>The model correctly identifies 686 true early readmissions and 8,757 true non-readmissions. 573 early readmissions are missed (false negatives), a clinically significant consideration discussed in Section 6.4. See Figure 23</w:t>
+        <w:t>The model correctly identifies 686 true early readmissions and 8,757 true non-readmissions. 573 early readmissions are missed (false negatives), a clinically significant consideration discussed in Section 6.4. See Figure 2</w:t>
+      </w:r>
+      <w:r>
+        <w:rPr>
+          <w:lang w:val="en-GB"/>
+        </w:rPr>
+        <w:t>4</w:t>
+      </w:r>
+      <w:r>
+        <w:rPr>
+          <w:lang w:val="en-GB"/>
+        </w:rPr>
+        <w:t>.</w:t>
       </w:r>
     </w:p>
     <w:p>
@@ -8412,7 +9514,7 @@
               <wp:inline distT="0" distB="0" distL="0" distR="0">
                 <wp:extent cx="3958590" cy="3462020"/>
                 <wp:effectExtent l="0" t="0" r="0" b="0"/>
-                <wp:docPr id="68" name="Frame23"/>
+                <wp:docPr id="70" name="Frame23"/>
                 <a:graphic xmlns:a="http://schemas.openxmlformats.org/drawingml/2006/main">
                   <a:graphicData uri="http://schemas.microsoft.com/office/word/2010/wordprocessingShape">
                     <wps:wsp>
@@ -8453,7 +9555,7 @@
                                 <wp:inline distT="0" distB="0" distL="0" distR="0">
                                   <wp:extent cx="3958590" cy="3322320"/>
                                   <wp:effectExtent l="0" t="0" r="0" b="0"/>
-                                  <wp:docPr id="69" name="Picture 8"/>
+                                  <wp:docPr id="71" name="Picture 8"/>
                                   <wp:cNvGraphicFramePr>
                                     <a:graphicFrameLocks xmlns:a="http://schemas.openxmlformats.org/drawingml/2006/main" noChangeAspect="1"/>
                                   </wp:cNvGraphicFramePr>
@@ -8461,13 +9563,13 @@
                                     <a:graphicData uri="http://schemas.openxmlformats.org/drawingml/2006/picture">
                                       <pic:pic xmlns:pic="http://schemas.openxmlformats.org/drawingml/2006/picture">
                                         <pic:nvPicPr>
-                                          <pic:cNvPr id="69" name="Picture 8"/>
+                                          <pic:cNvPr id="71" name="Picture 8"/>
                                           <pic:cNvPicPr>
                                             <a:picLocks noChangeAspect="1" noChangeArrowheads="1"/>
                                           </pic:cNvPicPr>
                                         </pic:nvPicPr>
                                         <pic:blipFill>
-                                          <a:blip r:embed="rId47"/>
+                                          <a:blip r:embed="rId48"/>
                                           <a:stretch>
                                             <a:fillRect/>
                                           </a:stretch>
@@ -8506,7 +9608,7 @@
                             </w:r>
                             <w:r>
                               <w:rPr/>
-                              <w:t>23</w:t>
+                              <w:t>24</w:t>
                             </w:r>
                             <w:r>
                               <w:rPr/>
@@ -8548,7 +9650,7 @@
                           <wp:inline distT="0" distB="0" distL="0" distR="0">
                             <wp:extent cx="3958590" cy="3322320"/>
                             <wp:effectExtent l="0" t="0" r="0" b="0"/>
-                            <wp:docPr id="70" name="Picture 8"/>
+                            <wp:docPr id="72" name="Picture 8"/>
                             <wp:cNvGraphicFramePr>
                               <a:graphicFrameLocks xmlns:a="http://schemas.openxmlformats.org/drawingml/2006/main" noChangeAspect="1"/>
                             </wp:cNvGraphicFramePr>
@@ -8556,13 +9658,13 @@
                               <a:graphicData uri="http://schemas.openxmlformats.org/drawingml/2006/picture">
                                 <pic:pic xmlns:pic="http://schemas.openxmlformats.org/drawingml/2006/picture">
                                   <pic:nvPicPr>
-                                    <pic:cNvPr id="70" name="Picture 8"/>
+                                    <pic:cNvPr id="72" name="Picture 8"/>
                                     <pic:cNvPicPr>
                                       <a:picLocks noChangeAspect="1" noChangeArrowheads="1"/>
                                     </pic:cNvPicPr>
                                   </pic:nvPicPr>
                                   <pic:blipFill>
-                                    <a:blip r:embed="rId48"/>
+                                    <a:blip r:embed="rId49"/>
                                     <a:stretch>
                                       <a:fillRect/>
                                     </a:stretch>
@@ -8601,7 +9703,7 @@
                       </w:r>
                       <w:r>
                         <w:rPr/>
-                        <w:t>23</w:t>
+                        <w:t>24</w:t>
                       </w:r>
                       <w:r>
                         <w:rPr/>
@@ -8631,13 +9733,19 @@
         <w:rPr>
           <w:lang w:val="en-GB"/>
         </w:rPr>
-        <w:t xml:space="preserve">Figure 24 shows the most important features. </w:t>
-      </w:r>
-      <w:r>
-        <w:rPr>
-          <w:lang w:val="en-GB"/>
-        </w:rPr>
-        <w:t>Discharge code and daily lab rate are the strongest predictors , consistent with Section 3.</w:t>
+        <w:t>Figure 2</w:t>
+      </w:r>
+      <w:r>
+        <w:rPr>
+          <w:lang w:val="en-GB"/>
+        </w:rPr>
+        <w:t>5</w:t>
+      </w:r>
+      <w:r>
+        <w:rPr>
+          <w:lang w:val="en-GB"/>
+        </w:rPr>
+        <w:t xml:space="preserve"> shows the most important features. Discharge code and daily lab rate are the strongest predictors , consistent with Section 3.</w:t>
       </w:r>
     </w:p>
     <w:p>
@@ -8650,29 +9758,38 @@
       </w:pPr>
       <w:r>
         <w:rPr/>
-      </w:r>
-      <w:r>
         <mc:AlternateContent>
           <mc:Choice Requires="wps">
             <w:drawing>
               <wp:inline distT="0" distB="0" distL="0" distR="0">
                 <wp:extent cx="5029200" cy="3878580"/>
                 <wp:effectExtent l="0" t="0" r="0" b="0"/>
-                <wp:docPr id="71" name="Frame24"/>
+                <wp:docPr id="73" name="Frame24"/>
                 <a:graphic xmlns:a="http://schemas.openxmlformats.org/drawingml/2006/main">
                   <a:graphicData uri="http://schemas.microsoft.com/office/word/2010/wordprocessingShape">
                     <wps:wsp>
-                      <wps:cNvSpPr txBox="1"/>
+                      <wps:cNvSpPr/>
                       <wps:spPr>
                         <a:xfrm>
                           <a:off x="0" y="0"/>
-                          <a:ext cx="5029200" cy="3878580"/>
+                          <a:ext cx="5029200" cy="3878640"/>
                         </a:xfrm>
-                        <a:prstGeom prst="rect"/>
+                        <a:prstGeom prst="rect">
+                          <a:avLst/>
+                        </a:prstGeom>
                         <a:solidFill>
                           <a:srgbClr val="FFFFFF"/>
                         </a:solidFill>
+                        <a:ln w="0">
+                          <a:noFill/>
+                        </a:ln>
                       </wps:spPr>
+                      <wps:style>
+                        <a:lnRef idx="0"/>
+                        <a:fillRef idx="0"/>
+                        <a:effectRef idx="0"/>
+                        <a:fontRef idx="minor"/>
+                      </wps:style>
                       <wps:txbx>
                         <w:txbxContent>
                           <w:p>
@@ -8688,7 +9805,7 @@
                                 <wp:inline distT="0" distB="0" distL="0" distR="0">
                                   <wp:extent cx="5029200" cy="3738880"/>
                                   <wp:effectExtent l="0" t="0" r="0" b="0"/>
-                                  <wp:docPr id="72" name="Picture 9"/>
+                                  <wp:docPr id="74" name="Picture 9"/>
                                   <wp:cNvGraphicFramePr>
                                     <a:graphicFrameLocks xmlns:a="http://schemas.openxmlformats.org/drawingml/2006/main" noChangeAspect="1"/>
                                   </wp:cNvGraphicFramePr>
@@ -8696,13 +9813,13 @@
                                     <a:graphicData uri="http://schemas.openxmlformats.org/drawingml/2006/picture">
                                       <pic:pic xmlns:pic="http://schemas.openxmlformats.org/drawingml/2006/picture">
                                         <pic:nvPicPr>
-                                          <pic:cNvPr id="72" name="Picture 9"/>
+                                          <pic:cNvPr id="74" name="Picture 9"/>
                                           <pic:cNvPicPr>
                                             <a:picLocks noChangeAspect="1" noChangeArrowheads="1"/>
                                           </pic:cNvPicPr>
                                         </pic:nvPicPr>
                                         <pic:blipFill>
-                                          <a:blip r:embed="rId49"/>
+                                          <a:blip r:embed="rId50"/>
                                           <a:stretch>
                                             <a:fillRect/>
                                           </a:stretch>
@@ -8722,6 +9839,9 @@
                                   </a:graphic>
                                 </wp:inline>
                               </w:drawing>
+                            </w:r>
+                            <w:r>
+                              <w:rPr/>
                               <w:t xml:space="preserve">Figure </w:t>
                             </w:r>
                             <w:r>
@@ -8738,7 +9858,7 @@
                             </w:r>
                             <w:r>
                               <w:rPr/>
-                              <w:t>24</w:t>
+                              <w:t>25</w:t>
                             </w:r>
                             <w:r>
                               <w:rPr/>
@@ -8751,7 +9871,7 @@
                           </w:p>
                         </w:txbxContent>
                       </wps:txbx>
-                      <wps:bodyPr anchor="t" lIns="0" tIns="0" rIns="0" bIns="0">
+                      <wps:bodyPr lIns="0" tIns="0" rIns="0" bIns="0" anchor="t">
                         <a:noAutofit/>
                       </wps:bodyPr>
                     </wps:wsp>
@@ -8762,8 +9882,10 @@
           </mc:Choice>
           <mc:Fallback>
             <w:pict>
-              <v:rect style="position:absolute;rotation:-0;width:396pt;height:305.4pt;mso-wrap-distance-left:0pt;mso-wrap-distance-right:0pt;mso-wrap-distance-top:0pt;mso-wrap-distance-bottom:0pt;margin-top:-305.4pt;mso-position-vertical:top;mso-position-vertical-relative:text;margin-left:0pt;mso-position-horizontal:center;mso-position-horizontal-relative:text">
-                <v:textbox inset="0in,0in,0in,0in">
+              <v:rect id="shape_0" fillcolor="white" stroked="f" o:allowincell="f" style="position:absolute;margin-left:0pt;margin-top:-305.45pt;width:395.95pt;height:305.35pt;mso-wrap-style:square;v-text-anchor:top;mso-position-vertical:top">
+                <v:fill o:detectmouseclick="t" type="solid" color2="black"/>
+                <v:stroke color="#3465a4" joinstyle="round" endcap="flat"/>
+                <v:textbox>
                   <w:txbxContent>
                     <w:p>
                       <w:pPr>
@@ -8778,7 +9900,7 @@
                           <wp:inline distT="0" distB="0" distL="0" distR="0">
                             <wp:extent cx="5029200" cy="3738880"/>
                             <wp:effectExtent l="0" t="0" r="0" b="0"/>
-                            <wp:docPr id="73" name="Picture 9"/>
+                            <wp:docPr id="75" name="Picture 9"/>
                             <wp:cNvGraphicFramePr>
                               <a:graphicFrameLocks xmlns:a="http://schemas.openxmlformats.org/drawingml/2006/main" noChangeAspect="1"/>
                             </wp:cNvGraphicFramePr>
@@ -8786,13 +9908,13 @@
                               <a:graphicData uri="http://schemas.openxmlformats.org/drawingml/2006/picture">
                                 <pic:pic xmlns:pic="http://schemas.openxmlformats.org/drawingml/2006/picture">
                                   <pic:nvPicPr>
-                                    <pic:cNvPr id="73" name="Picture 9"/>
+                                    <pic:cNvPr id="75" name="Picture 9"/>
                                     <pic:cNvPicPr>
                                       <a:picLocks noChangeAspect="1" noChangeArrowheads="1"/>
                                     </pic:cNvPicPr>
                                   </pic:nvPicPr>
                                   <pic:blipFill>
-                                    <a:blip r:embed="rId50"/>
+                                    <a:blip r:embed="rId51"/>
                                     <a:stretch>
                                       <a:fillRect/>
                                     </a:stretch>
@@ -8812,6 +9934,9 @@
                             </a:graphic>
                           </wp:inline>
                         </w:drawing>
+                      </w:r>
+                      <w:r>
+                        <w:rPr/>
                         <w:t xml:space="preserve">Figure </w:t>
                       </w:r>
                       <w:r>
@@ -8828,7 +9953,7 @@
                       </w:r>
                       <w:r>
                         <w:rPr/>
-                        <w:t>24</w:t>
+                        <w:t>25</w:t>
                       </w:r>
                       <w:r>
                         <w:rPr/>
@@ -8841,7 +9966,7 @@
                     </w:p>
                   </w:txbxContent>
                 </v:textbox>
-                <w10:wrap type="square" side="largest"/>
+                <w10:wrap type="square"/>
               </v:rect>
             </w:pict>
           </mc:Fallback>
@@ -8850,32 +9975,20 @@
     </w:p>
     <w:p>
       <w:pPr>
-        <w:pStyle w:val="Normal"/>
-        <w:jc w:val="center"/>
-        <w:rPr>
-          <w:lang w:val="en-GB"/>
-        </w:rPr>
-      </w:pPr>
-      <w:r>
-        <w:rPr/>
+        <w:pStyle w:val="Heading2"/>
+        <w:rPr>
+          <w:lang w:val="en-GB"/>
+        </w:rPr>
+      </w:pPr>
+      <w:r>
+        <w:rPr>
+          <w:lang w:val="en-GB"/>
+        </w:rPr>
+        <w:t>6.2 Comparison with Published Literature</w:t>
       </w:r>
     </w:p>
     <w:p>
       <w:pPr>
-        <w:pStyle w:val="Heading2"/>
-        <w:rPr>
-          <w:lang w:val="en-GB"/>
-        </w:rPr>
-      </w:pPr>
-      <w:r>
-        <w:rPr>
-          <w:lang w:val="en-GB"/>
-        </w:rPr>
-        <w:t>6.2 Comparison with Published Literature</w:t>
-      </w:r>
-    </w:p>
-    <w:p>
-      <w:pPr>
         <w:pStyle w:val="Normal"/>
         <w:rPr>
           <w:lang w:val="en-GB"/>
@@ -8885,7 +9998,19 @@
         <w:rPr>
           <w:lang w:val="en-GB"/>
         </w:rPr>
-        <w:t>Table 3 shows ROC-AUC scores from peer-reviewed studies that applied machine learning to the same dataset with the same binary 30-day readmission target, enabling direct comparison.</w:t>
+        <w:t xml:space="preserve">Table </w:t>
+      </w:r>
+      <w:r>
+        <w:rPr>
+          <w:lang w:val="en-GB"/>
+        </w:rPr>
+        <w:t>4</w:t>
+      </w:r>
+      <w:r>
+        <w:rPr>
+          <w:lang w:val="en-GB"/>
+        </w:rPr>
+        <w:t xml:space="preserve"> shows ROC-AUC scores from peer-reviewed studies that applied machine learning to the same dataset with the same binary 30-day readmission target.</w:t>
       </w:r>
     </w:p>
     <w:tbl>
@@ -10393,7 +11518,7 @@
       </w:r>
       <w:r>
         <w:rPr/>
-        <w:t>3</w:t>
+        <w:t>4</w:t>
       </w:r>
       <w:r>
         <w:rPr/>
@@ -10415,19 +11540,7 @@
         <w:rPr>
           <w:lang w:val="en-GB"/>
         </w:rPr>
-        <w:t>The G</w:t>
-      </w:r>
-      <w:r>
-        <w:rPr>
-          <w:lang w:val="en-GB"/>
-        </w:rPr>
-        <w:t>B</w:t>
-      </w:r>
-      <w:r>
-        <w:rPr>
-          <w:lang w:val="en-GB"/>
-        </w:rPr>
-        <w:t xml:space="preserve"> result of 0.6553 falls within the published range of 0.630–0.667, between Liu et al. [6] at 0.64 and Emi-Johnson and Nkrumah [2] at 0.667. Shang et al. [8] compared down-sampling with SMOTE oversampling and found down-sampling marginally superior.</w:t>
+        <w:t>The GB result of 0.6553 falls within the published range of 0.630–0.667, between Liu et al. [6] at 0.64 and Emi-Johnson and Nkrumah [2] at 0.667. Shang et al. [8] compared down-sampling with SMOTE oversampling and found down-sampling marginally superior.</w:t>
       </w:r>
     </w:p>
     <w:p>
@@ -10441,115 +11554,7 @@
         <w:rPr>
           <w:lang w:val="en-GB"/>
         </w:rPr>
-        <w:t>L</w:t>
-      </w:r>
-      <w:r>
-        <w:rPr>
-          <w:lang w:val="en-GB"/>
-        </w:rPr>
-        <w:t>R a</w:t>
-      </w:r>
-      <w:r>
-        <w:rPr>
-          <w:lang w:val="en-GB"/>
-        </w:rPr>
-        <w:t xml:space="preserve">chieved an AUC of 0.6388, below Liu et al. [6] at 0.64. This reflects </w:t>
-      </w:r>
-      <w:r>
-        <w:rPr>
-          <w:lang w:val="en-GB"/>
-        </w:rPr>
-        <w:t xml:space="preserve">the </w:t>
-      </w:r>
-      <w:r>
-        <w:rPr>
-          <w:lang w:val="en-GB"/>
-        </w:rPr>
-        <w:t xml:space="preserve">benefits from GB’s non-linear modelling capacity. Kansagara et al. [5] reviewed 30 studies of readmission risk models and found </w:t>
-      </w:r>
-      <w:r>
-        <w:rPr>
-          <w:lang w:val="en-GB"/>
-        </w:rPr>
-        <w:t>ROC-AUC</w:t>
-      </w:r>
-      <w:r>
-        <w:rPr>
-          <w:lang w:val="en-GB"/>
-        </w:rPr>
-        <w:t xml:space="preserve"> from 0.55 to 0.83. </w:t>
-      </w:r>
-      <w:r>
-        <w:rPr>
-          <w:lang w:val="en-GB"/>
-        </w:rPr>
-        <w:t>M</w:t>
-      </w:r>
-      <w:r>
-        <w:rPr>
-          <w:lang w:val="en-GB"/>
-        </w:rPr>
-        <w:t>odels using only administrative data consistently underperform</w:t>
-      </w:r>
-      <w:r>
-        <w:rPr>
-          <w:lang w:val="en-GB"/>
-        </w:rPr>
-        <w:t xml:space="preserve">ed </w:t>
-      </w:r>
-      <w:r>
-        <w:rPr>
-          <w:lang w:val="en-GB"/>
-        </w:rPr>
-        <w:t xml:space="preserve">those </w:t>
-      </w:r>
-      <w:r>
-        <w:rPr>
-          <w:lang w:val="en-GB"/>
-        </w:rPr>
-        <w:t>using</w:t>
-      </w:r>
-      <w:r>
-        <w:rPr>
-          <w:lang w:val="en-GB"/>
-        </w:rPr>
-        <w:t xml:space="preserve"> </w:t>
-      </w:r>
-      <w:r>
-        <w:rPr>
-          <w:lang w:val="en-GB"/>
-        </w:rPr>
-        <w:t>data with socia</w:t>
-      </w:r>
-      <w:r>
-        <w:rPr>
-          <w:lang w:val="en-GB"/>
-        </w:rPr>
-        <w:t xml:space="preserve">l </w:t>
-      </w:r>
-      <w:r>
-        <w:rPr>
-          <w:lang w:val="en-GB"/>
-        </w:rPr>
-        <w:t>factors, which are</w:t>
-      </w:r>
-      <w:r>
-        <w:rPr>
-          <w:lang w:val="en-GB"/>
-        </w:rPr>
-        <w:t xml:space="preserve"> absent from th</w:t>
-      </w:r>
-      <w:r>
-        <w:rPr>
-          <w:lang w:val="en-GB"/>
-        </w:rPr>
-        <w:t>is</w:t>
-      </w:r>
-      <w:r>
-        <w:rPr>
-          <w:lang w:val="en-GB"/>
-        </w:rPr>
-        <w:t xml:space="preserve"> dataset. A result of 0.6553 is therefore consistent with the expected ceiling for administrative-data models.</w:t>
+        <w:t>LR achieved an AUC of 0.6388, below Liu et al. [6] at 0.64. This reflects the benefits from GB’s non-linear modelling capacity. Kansagara et al. [5] reviewed 30 studies of readmission risk models and found ROC-AUC from 0.55 to 0.83. Models using only administrative data consistently underperformed those using data with social factors, which are absent from this dataset. A result of 0.6553 is therefore consistent with the expected ceiling for administrative-data models.</w:t>
       </w:r>
     </w:p>
     <w:p>
@@ -10577,43 +11582,31 @@
         <w:rPr>
           <w:lang w:val="en-GB"/>
         </w:rPr>
-        <w:t xml:space="preserve">ROC-AUC is the primary evaluation metric because it measures discriminative ability across all </w:t>
-      </w:r>
-      <w:r>
-        <w:rPr>
-          <w:lang w:val="en-GB"/>
-        </w:rPr>
-        <w:t>decision</w:t>
-      </w:r>
-      <w:r>
-        <w:rPr>
-          <w:lang w:val="en-GB"/>
-        </w:rPr>
-        <w:t xml:space="preserve"> </w:t>
-      </w:r>
-      <w:r>
-        <w:rPr>
-          <w:lang w:val="en-GB"/>
-        </w:rPr>
-        <w:t xml:space="preserve">boundaries. It </w:t>
-      </w:r>
-      <w:r>
-        <w:rPr>
-          <w:lang w:val="en-GB"/>
-        </w:rPr>
-        <w:t xml:space="preserve">is robust to </w:t>
-      </w:r>
-      <w:r>
-        <w:rPr>
-          <w:lang w:val="en-GB"/>
-        </w:rPr>
-        <w:t>the class inbalance observed with this dataset</w:t>
-      </w:r>
-      <w:r>
-        <w:rPr>
-          <w:lang w:val="en-GB"/>
-        </w:rPr>
-        <w:t>. With an 8.9% positive rate, accuracy is misleading. A classifier that predicts 'not early' for every patient achieves 91.1% accuracy while flagging no at-risk patients. All four benchmark studies in Table 3 use ROC-AUC as their primary metric, making direct numerical comparison valid.</w:t>
+        <w:t xml:space="preserve">ROC-AUC is the primary evaluation metric because it measures discriminative ability across all decision boundaries. It is robust to the class inbalance </w:t>
+      </w:r>
+      <w:r>
+        <w:rPr>
+          <w:lang w:val="en-GB"/>
+        </w:rPr>
+        <w:t>present in</w:t>
+      </w:r>
+      <w:r>
+        <w:rPr>
+          <w:lang w:val="en-GB"/>
+        </w:rPr>
+        <w:t xml:space="preserve"> this dataset. With an 8.9% positive rate, accuracy is misleading. A </w:t>
+      </w:r>
+      <w:r>
+        <w:rPr>
+          <w:lang w:val="en-GB"/>
+        </w:rPr>
+        <w:t>model</w:t>
+      </w:r>
+      <w:r>
+        <w:rPr>
+          <w:lang w:val="en-GB"/>
+        </w:rPr>
+        <w:t xml:space="preserve"> that predicts 'not early' for every patient achieves 91.1% accuracy while flagging no at-risk patients. All four benchmark studies in Table 3 use ROC-AUC as their primary metric, making direct numerical comparison valid.</w:t>
       </w:r>
     </w:p>
     <w:p>
@@ -10627,13 +11620,7 @@
         <w:rPr>
           <w:lang w:val="en-GB"/>
         </w:rPr>
-        <w:t xml:space="preserve">Average Precision (0.1698) complements ROC-AUC by measuring precision across recall thresholds under class imbalance. A random classifier would achieve an AP equal to the prevalence rate (0.089), so 0.1698 represents approximately 91% improvement over chance. The minority-class F1 of 0.228 is low, reflecting the </w:t>
-      </w:r>
-      <w:r>
-        <w:rPr>
-          <w:lang w:val="en-GB"/>
-        </w:rPr>
-        <w:t>imbalance in this dataset.</w:t>
+        <w:t>Average Precision (0.1698) complements ROC-AUC by measuring precision across recall thresholds under class imbalance. A random classifier would score 0.089 (matching the 8.9% readmission rate). The model scores 0.1698, meaning it is substantially better than random guessing. The minority-class F1 of 0.228 is low, reflecting the imbalance in this dataset.</w:t>
       </w:r>
     </w:p>
     <w:p>
@@ -10661,37 +11648,43 @@
         <w:rPr>
           <w:lang w:val="en-GB"/>
         </w:rPr>
-        <w:t xml:space="preserve">In a clinical setting, false negatives are more costly than false positives. A missed high-risk patient may return as an unplanned emergency, while a falsely flagged patient receives additional follow-up at </w:t>
-      </w:r>
-      <w:r>
-        <w:rPr>
-          <w:lang w:val="en-GB"/>
-        </w:rPr>
-        <w:t>lower</w:t>
-      </w:r>
-      <w:r>
-        <w:rPr>
-          <w:lang w:val="en-GB"/>
-        </w:rPr>
-        <w:t xml:space="preserve"> cost</w:t>
-      </w:r>
-      <w:r>
-        <w:rPr>
-          <w:lang w:val="en-GB"/>
-        </w:rPr>
-        <w:t>s</w:t>
-      </w:r>
-      <w:r>
-        <w:rPr>
-          <w:lang w:val="en-GB"/>
-        </w:rPr>
-        <w:t xml:space="preserve">. The classification threshold can be lowered below the default 0.5 to improve recall at the cost of precision. </w:t>
-      </w:r>
-      <w:r>
-        <w:rPr>
-          <w:lang w:val="en-GB"/>
-        </w:rPr>
-        <w:t>Recall is preferred over precision, to reduce chances not readmitting at-risk patients.</w:t>
+        <w:t xml:space="preserve">In a clinical setting, false negatives are more costly than false positives. A missed high-risk patient may return as an unplanned emergency, while a falsely flagged patient receives additional follow-up at lower costs. The classification threshold </w:t>
+      </w:r>
+      <w:r>
+        <w:rPr>
+          <w:lang w:val="en-GB"/>
+        </w:rPr>
+        <w:t>for</w:t>
+      </w:r>
+      <w:r>
+        <w:rPr>
+          <w:lang w:val="en-GB"/>
+        </w:rPr>
+        <w:t xml:space="preserve"> </w:t>
+      </w:r>
+      <w:r>
+        <w:rPr>
+          <w:lang w:val="en-GB"/>
+        </w:rPr>
+        <w:t xml:space="preserve">high-risk patients can </w:t>
+      </w:r>
+      <w:r>
+        <w:rPr>
+          <w:lang w:val="en-GB"/>
+        </w:rPr>
+        <w:t xml:space="preserve">be lowered below the default 0.5 to improve recall at the cost of precision. Recall </w:t>
+      </w:r>
+      <w:r>
+        <w:rPr>
+          <w:lang w:val="en-GB"/>
+        </w:rPr>
+        <w:t>may be</w:t>
+      </w:r>
+      <w:r>
+        <w:rPr>
+          <w:lang w:val="en-GB"/>
+        </w:rPr>
+        <w:t xml:space="preserve"> preferred over precision, to reduce chances not readmitting at-risk patients.</w:t>
       </w:r>
     </w:p>
     <w:p>
@@ -10719,13 +11712,7 @@
         <w:rPr>
           <w:lang w:val="en-GB"/>
         </w:rPr>
-        <w:t>1. T</w:t>
-      </w:r>
-      <w:r>
-        <w:rPr>
-          <w:lang w:val="en-GB"/>
-        </w:rPr>
-        <w:t xml:space="preserve">he dataset covers US hospitals from 1999–2008 and may not reflect current practice. </w:t>
+        <w:t xml:space="preserve">1. The dataset covers US hospitals from 1999–2008 and may not reflect current practice. </w:t>
       </w:r>
     </w:p>
     <w:p>
@@ -10739,37 +11726,7 @@
         <w:rPr>
           <w:lang w:val="en-GB"/>
         </w:rPr>
-        <w:t>2. A</w:t>
-      </w:r>
-      <w:r>
-        <w:rPr>
-          <w:lang w:val="en-GB"/>
-        </w:rPr>
-        <w:t xml:space="preserve">dministrative data lacks post-discharge and social </w:t>
-      </w:r>
-      <w:r>
-        <w:rPr>
-          <w:lang w:val="en-GB"/>
-        </w:rPr>
-        <w:t xml:space="preserve">information </w:t>
-      </w:r>
-      <w:r>
-        <w:rPr>
-          <w:lang w:val="en-GB"/>
-        </w:rPr>
-        <w:t xml:space="preserve">that explain a large </w:t>
-      </w:r>
-      <w:r>
-        <w:rPr>
-          <w:lang w:val="en-GB"/>
-        </w:rPr>
-        <w:t>number</w:t>
-      </w:r>
-      <w:r>
-        <w:rPr>
-          <w:lang w:val="en-GB"/>
-        </w:rPr>
-        <w:t xml:space="preserve"> of preventable readmissions.</w:t>
+        <w:t>2. Administrative data lacks post-discharge and social information that explain a large number of preventable readmissions.</w:t>
       </w:r>
     </w:p>
     <w:p>
@@ -10783,13 +11740,7 @@
         <w:rPr>
           <w:lang w:val="en-GB"/>
         </w:rPr>
-        <w:t>3. K</w:t>
-      </w:r>
-      <w:r>
-        <w:rPr>
-          <w:lang w:val="en-GB"/>
-        </w:rPr>
-        <w:t>eeping only one encounter per patient reduces the dataset from 101,766 to 70,439 records.</w:t>
+        <w:t>3. Keeping only one encounter per patient reduces the dataset from 101,766 to 70,439 records.</w:t>
       </w:r>
     </w:p>
     <w:p>
@@ -10818,19 +11769,7 @@
         <w:rPr>
           <w:lang w:val="en-GB"/>
         </w:rPr>
-        <w:t xml:space="preserve">This project applied a full data science pipeline to the UCI Diabetes 130-US Hospitals dataset to predict early 30-day hospital readmission. Cleaning reduced 101,766 raw records to 70,439 unique patient encounters, addressing deceased patients, data leakage, high-missingness columns, and encoding inconsistencies. EDA identified prior inpatient history and discharge disposition as the strongest predictors, consistent with Jencks et al </w:t>
-      </w:r>
-      <w:r>
-        <w:rPr>
-          <w:lang w:val="en-GB"/>
-        </w:rPr>
-        <w:t>[7]</w:t>
-      </w:r>
-      <w:r>
-        <w:rPr>
-          <w:lang w:val="en-GB"/>
-        </w:rPr>
-        <w:t xml:space="preserve"> and Shang et al</w:t>
+        <w:t>This project applied a full data science pipeline to the UCI Diabetes 130-US Hospitals dataset to predict early 30-day hospital readmission. Cleaning reduced 101,766 raw records to 70,439 unique patient encounters, addressing deceased patients, data leakage, high-missingness columns, and encoding inconsistencies. EDA identified prior inpatient history and discharge disposition as the strongest predictors, consistent with Jencks et al [7] and Shang et al</w:t>
       </w:r>
       <w:r>
         <w:rPr>
@@ -10866,19 +11805,7 @@
         <w:rPr>
           <w:lang w:val="en-GB"/>
         </w:rPr>
-        <w:t xml:space="preserve">Gradient Boosting achieved the best test ROC-AUC of 0.6553, within the published range of 0.630–0.667 [2, 6]. The 2.27% train-test gap confirms good generalisation. Kansagara et al. [5] found </w:t>
-      </w:r>
-      <w:r>
-        <w:rPr>
-          <w:lang w:val="en-GB"/>
-        </w:rPr>
-        <w:t xml:space="preserve">ROC-AUC </w:t>
-      </w:r>
-      <w:r>
-        <w:rPr>
-          <w:lang w:val="en-GB"/>
-        </w:rPr>
-        <w:t>from 0.55 to 0.83 across 30 readmission studies, placing this result within the expected range for administrative-data prediction.</w:t>
+        <w:t>Gradient Boosting achieved the best test ROC-AUC of 0.6553, within the published range of 0.630–0.667 [2, 6]. The 2.27% train-test gap confirms good generalisation. Kansagara et al. [5] found ROC-AUC from 0.55 to 0.83 across 30 readmission studies, placing this result within the expected range for administrative-data prediction.</w:t>
       </w:r>
     </w:p>
     <w:p>
@@ -13094,15 +14021,15 @@
       <w:u w:val="single"/>
     </w:rPr>
   </w:style>
-  <w:style w:type="character" w:styleId="FootnoteCharacters">
-    <w:name w:val="Footnote Characters"/>
+  <w:style w:type="character" w:styleId="FootnoteCharactersuser">
+    <w:name w:val="Footnote Characters (user)"/>
     <w:qFormat/>
     <w:rPr>
       <w:vertAlign w:val="superscript"/>
     </w:rPr>
   </w:style>
-  <w:style w:type="character" w:styleId="FootnoteCharactersuser">
-    <w:name w:val="Footnote Characters (user)"/>
+  <w:style w:type="character" w:styleId="FootnoteCharacters">
+    <w:name w:val="Footnote Characters"/>
     <w:qFormat/>
     <w:rPr>
       <w:vertAlign w:val="superscript"/>
@@ -13121,8 +14048,8 @@
       <w:rFonts w:ascii="Liberation Mono" w:hAnsi="Liberation Mono" w:eastAsia="Liberation Mono" w:cs="Liberation Mono"/>
     </w:rPr>
   </w:style>
-  <w:style w:type="character" w:styleId="Bullets">
-    <w:name w:val="Bullets"/>
+  <w:style w:type="character" w:styleId="Bulletsuser">
+    <w:name w:val="Bullets (user)"/>
     <w:qFormat/>
     <w:rPr>
       <w:rFonts w:ascii="OpenSymbol" w:hAnsi="OpenSymbol" w:eastAsia="OpenSymbol" w:cs="OpenSymbol"/>
@@ -13619,15 +14546,15 @@
     <w:pPr/>
     <w:rPr/>
   </w:style>
-  <w:style w:type="paragraph" w:styleId="FrameContentsuser">
-    <w:name w:val="Frame Contents (user)"/>
+  <w:style w:type="paragraph" w:styleId="FrameContents">
+    <w:name w:val="Frame Contents"/>
     <w:basedOn w:val="Normal"/>
     <w:qFormat/>
     <w:pPr/>
     <w:rPr/>
   </w:style>
-  <w:style w:type="paragraph" w:styleId="FrameContents">
-    <w:name w:val="Frame Contents"/>
+  <w:style w:type="paragraph" w:styleId="FrameContentsuser">
+    <w:name w:val="Frame Contents (user)"/>
     <w:basedOn w:val="Normal"/>
     <w:qFormat/>
     <w:pPr/>

</xml_diff>